<commit_message>
Update EDB360 report template
</commit_message>
<xml_diff>
--- a/templates/edb360_master.docx
+++ b/templates/edb360_master.docx
@@ -17,7 +17,7 @@
           <w:noProof/>
         </w:rPr>
         <w:drawing>
-          <wp:anchor distT="0" distB="0" distL="114300" distR="114300" simplePos="0" relativeHeight="251658241" behindDoc="0" locked="0" layoutInCell="1" allowOverlap="1" wp14:anchorId="100C2EA7" wp14:editId="17A54C3E">
+          <wp:anchor distT="0" distB="0" distL="114300" distR="114300" simplePos="0" relativeHeight="251658241" behindDoc="0" locked="0" layoutInCell="1" allowOverlap="1" wp14:anchorId="100C2EA7" wp14:editId="6B660BE1">
             <wp:simplePos x="0" y="0"/>
             <wp:positionH relativeFrom="margin">
               <wp:posOffset>4230370</wp:posOffset>
@@ -325,15 +325,6 @@
           <w:sz w:val="48"/>
         </w:rPr>
         <w:t>CƠ SỞ DỮ LIỆU {{database_display_name}}</w:t>
-      </w:r>
-      <w:r>
-        <w:rPr>
-          <w:rFonts w:cs="Arial"/>
-          <w:b/>
-          <w:bCs/>
-          <w:color w:val="0000FF"/>
-          <w:sz w:val="48"/>
-        </w:rPr>
       </w:r>
     </w:p>
     <w:p>
@@ -512,22 +503,6 @@
               </w:rPr>
               <w:t>{{version}}</w:t>
             </w:r>
-            <w:r>
-              <w:rPr>
-                <w:rFonts w:cs="Arial"/>
-                <w:b/>
-                <w:sz w:val="22"/>
-                <w:szCs w:val="22"/>
-              </w:rPr>
-            </w:r>
-            <w:r>
-              <w:rPr>
-                <w:rFonts w:cs="Arial"/>
-                <w:b/>
-                <w:sz w:val="22"/>
-                <w:szCs w:val="22"/>
-              </w:rPr>
-            </w:r>
           </w:p>
         </w:tc>
       </w:tr>
@@ -578,22 +553,6 @@
               </w:rPr>
               <w:t>{{collection_date}}</w:t>
             </w:r>
-            <w:r>
-              <w:rPr>
-                <w:rFonts w:cs="Arial"/>
-                <w:b/>
-                <w:sz w:val="22"/>
-                <w:szCs w:val="22"/>
-              </w:rPr>
-            </w:r>
-            <w:r>
-              <w:rPr>
-                <w:rFonts w:cs="Arial"/>
-                <w:b/>
-                <w:sz w:val="22"/>
-                <w:szCs w:val="22"/>
-              </w:rPr>
-            </w:r>
           </w:p>
         </w:tc>
       </w:tr>
@@ -690,7 +649,6 @@
             </w14:srgbClr>
           </w14:shadow>
         </w:rPr>
-        <w:lastRenderedPageBreak/>
         <w:t>MỤC LỤC</w:t>
       </w:r>
     </w:p>
@@ -4841,11 +4799,6 @@
           <w:rFonts w:cs="Arial"/>
         </w:rPr>
         <w:t>Tác giả: {{creator}}</w:t>
-      </w:r>
-      <w:r>
-        <w:rPr>
-          <w:rFonts w:cs="Arial"/>
-        </w:rPr>
       </w:r>
     </w:p>
     <w:tbl>
@@ -4980,11 +4933,6 @@
         </w:rPr>
         <w:t>Người phê duyệt: {{approver}}</w:t>
       </w:r>
-      <w:r>
-        <w:rPr>
-          <w:rFonts w:cs="Arial"/>
-        </w:rPr>
-      </w:r>
     </w:p>
     <w:tbl>
       <w:tblPr>
@@ -5136,9 +5084,9 @@
         <w:tblLook w:val="04A0" w:firstRow="1" w:lastRow="0" w:firstColumn="1" w:lastColumn="0" w:noHBand="0" w:noVBand="1"/>
       </w:tblPr>
       <w:tblGrid>
-        <w:gridCol w:w="2691"/>
-        <w:gridCol w:w="3982"/>
-        <w:gridCol w:w="2688"/>
+        <w:gridCol w:w="1448"/>
+        <w:gridCol w:w="3951"/>
+        <w:gridCol w:w="3962"/>
       </w:tblGrid>
       <w:tr>
         <w:tc>
@@ -5279,21 +5227,6 @@
               </w:rPr>
               <w:t>{{assessment_control_file}}</w:t>
             </w:r>
-            <w:r>
-              <w:rPr>
-                <w:rFonts w:ascii="Cambria" w:hAnsi="Cambria" w:cs="Arial"/>
-                <w:color w:val="000000"/>
-                <w:sz w:val="24"/>
-                <w:szCs w:val="24"/>
-              </w:rPr>
-            </w:r>
-            <w:r>
-              <w:rPr>
-                <w:rFonts w:ascii="Cambria" w:eastAsia="Cambria" w:hAnsi="Cambria" w:cs="Cambria"/>
-                <w:sz w:val="24"/>
-                <w:szCs w:val="24"/>
-              </w:rPr>
-            </w:r>
           </w:p>
           <w:p>
             <w:pPr>
@@ -5362,93 +5295,6 @@
                 <w:color w:val="auto"/>
               </w:rPr>
               <w:t>{{assessment_redo_log}}</w:t>
-            </w:r>
-            <w:r>
-              <w:rPr>
-                <w:rStyle w:val="fontstyle01"/>
-                <w:rFonts w:eastAsiaTheme="majorEastAsia"/>
-              </w:rPr>
-            </w:r>
-            <w:r>
-              <w:rPr>
-                <w:rStyle w:val="fontstyle01"/>
-                <w:rFonts w:eastAsiaTheme="majorEastAsia"/>
-                <w:color w:val="auto"/>
-              </w:rPr>
-            </w:r>
-            <w:r>
-              <w:rPr>
-                <w:rStyle w:val="fontstyle01"/>
-                <w:rFonts w:eastAsiaTheme="majorEastAsia"/>
-                <w:color w:val="auto"/>
-              </w:rPr>
-            </w:r>
-            <w:r>
-              <w:rPr>
-                <w:rStyle w:val="fontstyle01"/>
-                <w:rFonts w:eastAsiaTheme="majorEastAsia"/>
-                <w:color w:val="auto"/>
-              </w:rPr>
-            </w:r>
-            <w:r/>
-            <w:r>
-              <w:rPr>
-                <w:rStyle w:val="fontstyle01"/>
-                <w:rFonts w:eastAsiaTheme="majorEastAsia"/>
-                <w:color w:val="auto"/>
-              </w:rPr>
-            </w:r>
-            <w:r>
-              <w:rPr>
-                <w:rStyle w:val="fontstyle01"/>
-                <w:rFonts w:eastAsiaTheme="majorEastAsia"/>
-                <w:color w:val="auto"/>
-              </w:rPr>
-            </w:r>
-            <w:r/>
-            <w:r>
-              <w:rPr>
-                <w:rStyle w:val="fontstyle01"/>
-                <w:rFonts w:eastAsiaTheme="majorEastAsia"/>
-                <w:color w:val="auto"/>
-              </w:rPr>
-            </w:r>
-            <w:r>
-              <w:rPr>
-                <w:rStyle w:val="fontstyle01"/>
-                <w:rFonts w:eastAsiaTheme="majorEastAsia"/>
-                <w:color w:val="auto"/>
-              </w:rPr>
-            </w:r>
-            <w:r>
-              <w:rPr>
-                <w:rStyle w:val="fontstyle01"/>
-                <w:rFonts w:eastAsiaTheme="majorEastAsia"/>
-                <w:color w:val="auto"/>
-              </w:rPr>
-            </w:r>
-            <w:r/>
-            <w:r>
-              <w:rPr>
-                <w:rStyle w:val="fontstyle01"/>
-                <w:rFonts w:eastAsiaTheme="majorEastAsia"/>
-                <w:color w:val="auto"/>
-              </w:rPr>
-            </w:r>
-            <w:r>
-              <w:rPr>
-                <w:rStyle w:val="fontstyle01"/>
-                <w:rFonts w:eastAsiaTheme="majorEastAsia"/>
-                <w:color w:val="auto"/>
-              </w:rPr>
-            </w:r>
-            <w:r/>
-            <w:r>
-              <w:rPr>
-                <w:rStyle w:val="fontstyle01"/>
-                <w:rFonts w:eastAsiaTheme="majorEastAsia"/>
-                <w:color w:val="auto"/>
-              </w:rPr>
             </w:r>
           </w:p>
           <w:p>
@@ -5566,13 +5412,6 @@
               </w:rPr>
               <w:t>{{assessment_tablespace_usage}}</w:t>
             </w:r>
-            <w:r>
-              <w:rPr>
-                <w:rFonts w:ascii="Cambria" w:hAnsi="Cambria"/>
-                <w:sz w:val="24"/>
-                <w:szCs w:val="24"/>
-              </w:rPr>
-            </w:r>
           </w:p>
           <w:p>
             <w:pPr>
@@ -5582,13 +5421,6 @@
                 <w:szCs w:val="24"/>
               </w:rPr>
             </w:pPr>
-            <w:r>
-              <w:rPr>
-                <w:rFonts w:ascii="Cambria" w:eastAsia="Cambria" w:hAnsi="Cambria" w:cs="Cambria"/>
-                <w:sz w:val="24"/>
-                <w:szCs w:val="24"/>
-              </w:rPr>
-            </w:r>
           </w:p>
           <w:p>
             <w:pPr>
@@ -5755,11 +5587,6 @@
                 <w:szCs w:val="24"/>
               </w:rPr>
               <w:t>{{assessment_no_pk}}</w:t>
-            </w:r>
-            <w:r>
-              <w:rPr>
-                <w:i/>
-              </w:rPr>
             </w:r>
           </w:p>
           <w:p>
@@ -5952,20 +5779,6 @@
               </w:rPr>
               <w:t>{{assessment_stale_stats}}</w:t>
             </w:r>
-            <w:r>
-              <w:rPr>
-                <w:rFonts w:ascii="Cambria" w:hAnsi="Cambria"/>
-                <w:sz w:val="24"/>
-                <w:szCs w:val="24"/>
-              </w:rPr>
-            </w:r>
-            <w:r>
-              <w:rPr>
-                <w:rFonts w:ascii="Cambria" w:hAnsi="Cambria"/>
-                <w:sz w:val="24"/>
-                <w:szCs w:val="24"/>
-              </w:rPr>
-            </w:r>
           </w:p>
         </w:tc>
         <w:tc>
@@ -6039,7 +5852,6 @@
                 <w:sz w:val="24"/>
                 <w:szCs w:val="24"/>
               </w:rPr>
-              <w:lastRenderedPageBreak/>
               <w:t>6.2.1 Oracle Foreground Process</w:t>
             </w:r>
           </w:p>
@@ -6140,15 +5952,6 @@
                 <w:szCs w:val="24"/>
               </w:rPr>
             </w:pPr>
-            <w:r>
-              <w:rPr>
-                <w:rFonts w:ascii="Cambria" w:hAnsi="Cambria" w:cs="Arial"/>
-                <w:iCs/>
-                <w:color w:val="000000"/>
-                <w:sz w:val="24"/>
-                <w:szCs w:val="24"/>
-              </w:rPr>
-            </w:r>
           </w:p>
           <w:p>
             <w:pPr>
@@ -6159,15 +5962,6 @@
                 <w:szCs w:val="24"/>
               </w:rPr>
             </w:pPr>
-            <w:r>
-              <w:rPr>
-                <w:rFonts w:ascii="Cambria" w:hAnsi="Cambria" w:cs="Arial"/>
-                <w:iCs/>
-                <w:color w:val="000000"/>
-                <w:sz w:val="24"/>
-                <w:szCs w:val="24"/>
-              </w:rPr>
-            </w:r>
           </w:p>
           <w:p>
             <w:pPr>
@@ -6295,6 +6089,7 @@
                 <w:sz w:val="24"/>
                 <w:szCs w:val="24"/>
               </w:rPr>
+              <w:lastRenderedPageBreak/>
               <w:t>6.3.3.3 Library Cache Hit</w:t>
             </w:r>
           </w:p>
@@ -6464,6 +6259,13 @@
                 <w:szCs w:val="24"/>
               </w:rPr>
               <w:t>{{assessment_patching}}</w:t>
+            </w:r>
+            <w:r>
+              <w:rPr>
+                <w:rFonts w:ascii="Cambria" w:hAnsi="Cambria"/>
+                <w:sz w:val="24"/>
+                <w:szCs w:val="24"/>
+              </w:rPr>
               <w:br/>
               <w:t>{{assessment_backup}}</w:t>
             </w:r>
@@ -6476,13 +6278,6 @@
                 <w:szCs w:val="24"/>
               </w:rPr>
             </w:pPr>
-            <w:r>
-              <w:rPr>
-                <w:rFonts w:ascii="Cambria" w:hAnsi="Cambria"/>
-                <w:sz w:val="24"/>
-                <w:szCs w:val="24"/>
-              </w:rPr>
-            </w:r>
           </w:p>
           <w:p>
             <w:pPr>
@@ -6492,13 +6287,6 @@
                 <w:szCs w:val="24"/>
               </w:rPr>
             </w:pPr>
-            <w:r>
-              <w:rPr>
-                <w:rFonts w:ascii="Cambria" w:hAnsi="Cambria"/>
-                <w:sz w:val="24"/>
-                <w:szCs w:val="24"/>
-              </w:rPr>
-            </w:r>
           </w:p>
           <w:p>
             <w:pPr>
@@ -6510,15 +6298,6 @@
                 <w:shd w:val="clear" w:color="auto" w:fill="FFFFFF"/>
               </w:rPr>
             </w:pPr>
-            <w:r>
-              <w:rPr>
-                <w:rFonts w:ascii="Cambria" w:hAnsi="Cambria" w:cs="Segoe UI"/>
-                <w:color w:val="242424"/>
-                <w:sz w:val="24"/>
-                <w:szCs w:val="24"/>
-                <w:shd w:val="clear" w:color="auto" w:fill="FFFFFF"/>
-              </w:rPr>
-            </w:r>
           </w:p>
           <w:p>
             <w:pPr>
@@ -6549,6 +6328,13 @@
                 <w:szCs w:val="24"/>
               </w:rPr>
               <w:t>{{recommendation_patching}}</w:t>
+            </w:r>
+            <w:r>
+              <w:rPr>
+                <w:rFonts w:ascii="Cambria" w:hAnsi="Cambria"/>
+                <w:sz w:val="24"/>
+                <w:szCs w:val="24"/>
+              </w:rPr>
               <w:br/>
               <w:t>{{recommendation_backup}}</w:t>
             </w:r>
@@ -6610,12 +6396,6 @@
         </w:rPr>
       </w:pPr>
       <w:r>
-        <w:rPr>
-          <w:rFonts w:eastAsia="Cambria" w:cs="Cambria"/>
-          <w:b/>
-        </w:rPr>
-      </w:r>
-      <w:r>
         <w:t>&lt;system_under_observation&gt;</w:t>
       </w:r>
     </w:p>
@@ -6628,7 +6408,6 @@
         </w:rPr>
       </w:pPr>
     </w:p>
-    <w:bookmarkEnd w:id="18"/>
     <w:p>
       <w:pPr>
         <w:numPr>
@@ -6662,66 +6441,57 @@
         </w:rPr>
       </w:pPr>
       <w:r>
+        <w:t>&lt;identification&gt;</w:t>
+      </w:r>
+    </w:p>
+    <w:p>
+      <w:pPr>
+        <w:spacing w:before="0" w:after="160" w:line="259" w:lineRule="auto"/>
+        <w:ind w:left="720"/>
         <w:rPr>
           <w:rFonts w:eastAsia="Cambria" w:cs="Cambria"/>
           <w:b/>
         </w:rPr>
-      </w:r>
-      <w:r>
-        <w:t>&lt;identification&gt;</w:t>
-      </w:r>
-    </w:p>
-    <w:p>
-      <w:pPr>
-        <w:spacing w:before="0" w:after="160" w:line="259" w:lineRule="auto"/>
-        <w:ind w:left="720"/>
-        <w:rPr>
-          <w:rFonts w:eastAsia="Cambria" w:cs="Cambria"/>
-          <w:b/>
-        </w:rPr>
       </w:pPr>
     </w:p>
     <w:p>
       <w:pPr>
         <w:pStyle w:val="Heading1"/>
       </w:pPr>
-      <w:bookmarkStart w:id="19" w:name="_Toc170980834"/>
+      <w:bookmarkStart w:id="18" w:name="_Toc170980834"/>
       <w:r>
         <w:lastRenderedPageBreak/>
         <w:t>ĐÁNH GIÁ CẤU HÌNH</w:t>
       </w:r>
+      <w:bookmarkEnd w:id="18"/>
+    </w:p>
+    <w:p>
+      <w:pPr>
+        <w:pStyle w:val="Heading2"/>
+      </w:pPr>
+      <w:bookmarkStart w:id="19" w:name="_Toc170980835"/>
+      <w:r>
+        <w:t>CẤU HÌNH VẬT LÝ</w:t>
+      </w:r>
       <w:bookmarkEnd w:id="19"/>
-    </w:p>
-    <w:p>
-      <w:pPr>
-        <w:pStyle w:val="Heading2"/>
-      </w:pPr>
-      <w:bookmarkStart w:id="20" w:name="_Toc170980835"/>
-      <w:r>
-        <w:t>CẤU HÌNH VẬT LÝ</w:t>
-      </w:r>
+      <w:r>
+        <w:t xml:space="preserve"> </w:t>
+      </w:r>
+    </w:p>
+    <w:p>
+      <w:pPr>
+        <w:pStyle w:val="Heading3"/>
+      </w:pPr>
+      <w:r>
+        <w:t>CONTROL FILE</w:t>
+      </w:r>
+    </w:p>
+    <w:p>
+      <w:pPr>
+        <w:pStyle w:val="Heading3"/>
+      </w:pPr>
+      <w:bookmarkStart w:id="20" w:name="_Toc170980836"/>
       <w:bookmarkEnd w:id="20"/>
-      <w:r>
-        <w:t xml:space="preserve"> </w:t>
-      </w:r>
-    </w:p>
-    <w:p>
-      <w:pPr>
-        <w:pStyle w:val="Heading3"/>
-      </w:pPr>
-      <w:bookmarkStart w:id="21" w:name="_Toc170980836"/>
-      <w:r>
-        <w:t>CONTROL FILE</w:t>
-      </w:r>
-      <w:bookmarkEnd w:id="21"/>
-    </w:p>
-    <w:p>
-      <w:pPr>
-        <w:pStyle w:val="Heading3"/>
-      </w:pPr>
-      <w:bookmarkStart w:id="21" w:name="_Toc170980836"/>
-      <w:r/>
-      <w:bookmarkEnd w:id="21"/>
       <w:r>
         <w:t>&lt;control_files&gt;</w:t>
       </w:r>
@@ -6763,17 +6533,6 @@
         </w:rPr>
         <w:t>{{assessment_control_file}}</w:t>
       </w:r>
-      <w:r>
-        <w:rPr>
-          <w:rFonts w:cs="Arial"/>
-          <w:color w:val="000000"/>
-        </w:rPr>
-      </w:r>
-      <w:r>
-        <w:rPr>
-          <w:rFonts w:eastAsia="Cambria" w:cs="Cambria"/>
-        </w:rPr>
-      </w:r>
     </w:p>
     <w:p>
       <w:pPr>
@@ -6809,16 +6568,6 @@
         </w:rPr>
       </w:pPr>
       <w:r>
-        <w:rPr>
-          <w:b/>
-        </w:rPr>
-      </w:r>
-      <w:r>
-        <w:rPr>
-          <w:b/>
-        </w:rPr>
-      </w:r>
-      <w:r>
         <w:t>{{recommendation_control_file}}</w:t>
       </w:r>
     </w:p>
@@ -6826,11 +6575,11 @@
       <w:pPr>
         <w:pStyle w:val="Heading3"/>
       </w:pPr>
-      <w:bookmarkStart w:id="22" w:name="_Toc170980837"/>
+      <w:bookmarkStart w:id="21" w:name="_Toc170980837"/>
       <w:r>
         <w:t>ONLINE REDO LOG</w:t>
       </w:r>
-      <w:bookmarkEnd w:id="22"/>
+      <w:bookmarkEnd w:id="21"/>
     </w:p>
     <w:p>
       <w:pPr>
@@ -6849,7 +6598,6 @@
           <w:lang w:val="en-US"/>
         </w:rPr>
       </w:pPr>
-      <w:bookmarkStart w:id="23" w:name="_Toc170980838"/>
       <w:r>
         <w:rPr>
           <w:color w:val="auto"/>
@@ -6857,7 +6605,6 @@
         </w:rPr>
         <w:t>CẤU HÌNH REDO LOG</w:t>
       </w:r>
-      <w:bookmarkEnd w:id="23"/>
     </w:p>
     <w:p>
       <w:pPr>
@@ -6876,14 +6623,6 @@
           <w:lang w:val="en-US"/>
         </w:rPr>
       </w:pPr>
-      <w:bookmarkStart w:id="23" w:name="_Toc170980838"/>
-      <w:r>
-        <w:rPr>
-          <w:color w:val="auto"/>
-          <w:lang w:val="en-US"/>
-        </w:rPr>
-      </w:r>
-      <w:bookmarkEnd w:id="23"/>
       <w:r>
         <w:t>&lt;redo_log&gt;</w:t>
       </w:r>
@@ -6905,14 +6644,8 @@
           <w:lang w:val="en-US"/>
         </w:rPr>
       </w:pPr>
-      <w:bookmarkStart w:id="23" w:name="_Toc170980838"/>
-      <w:r>
-        <w:rPr>
-          <w:color w:val="auto"/>
-          <w:lang w:val="en-US"/>
-        </w:rPr>
-      </w:r>
-      <w:bookmarkEnd w:id="23"/>
+      <w:bookmarkStart w:id="22" w:name="_Toc170980838"/>
+      <w:bookmarkEnd w:id="22"/>
       <w:r>
         <w:t>&lt;redo_log_files&gt;</w:t>
       </w:r>
@@ -6951,179 +6684,11 @@
         </w:rPr>
         <w:t>{{assessment_redo_log}}</w:t>
       </w:r>
-      <w:r>
-        <w:rPr>
-          <w:rStyle w:val="fontstyle01"/>
-          <w:rFonts w:eastAsiaTheme="majorEastAsia"/>
-          <w:color w:val="auto"/>
-        </w:rPr>
-      </w:r>
-      <w:r>
-        <w:rPr>
-          <w:rStyle w:val="fontstyle01"/>
-          <w:rFonts w:eastAsiaTheme="majorEastAsia"/>
-          <w:color w:val="auto"/>
-        </w:rPr>
-      </w:r>
-      <w:r>
-        <w:rPr>
-          <w:rStyle w:val="fontstyle01"/>
-          <w:rFonts w:eastAsiaTheme="majorEastAsia"/>
-          <w:color w:val="auto"/>
-        </w:rPr>
-      </w:r>
-      <w:r/>
-      <w:r>
-        <w:rPr>
-          <w:rStyle w:val="fontstyle01"/>
-          <w:rFonts w:eastAsiaTheme="majorEastAsia"/>
-          <w:color w:val="auto"/>
-        </w:rPr>
-      </w:r>
-      <w:r>
-        <w:rPr>
-          <w:rStyle w:val="fontstyle01"/>
-          <w:rFonts w:eastAsiaTheme="majorEastAsia"/>
-          <w:color w:val="auto"/>
-        </w:rPr>
-      </w:r>
-      <w:r/>
-      <w:r>
-        <w:rPr>
-          <w:rStyle w:val="fontstyle01"/>
-          <w:rFonts w:eastAsiaTheme="majorEastAsia"/>
-          <w:color w:val="auto"/>
-        </w:rPr>
-      </w:r>
-      <w:r>
-        <w:rPr>
-          <w:rStyle w:val="fontstyle01"/>
-          <w:rFonts w:eastAsiaTheme="majorEastAsia"/>
-          <w:color w:val="auto"/>
-        </w:rPr>
-      </w:r>
-      <w:r>
-        <w:rPr>
-          <w:rStyle w:val="fontstyle01"/>
-          <w:rFonts w:eastAsiaTheme="majorEastAsia"/>
-          <w:color w:val="auto"/>
-        </w:rPr>
-      </w:r>
-      <w:r/>
-      <w:r>
-        <w:rPr>
-          <w:rStyle w:val="fontstyle01"/>
-          <w:rFonts w:eastAsiaTheme="majorEastAsia"/>
-          <w:color w:val="auto"/>
-        </w:rPr>
-      </w:r>
-      <w:r>
-        <w:rPr>
-          <w:rStyle w:val="fontstyle01"/>
-          <w:rFonts w:eastAsiaTheme="majorEastAsia"/>
-          <w:color w:val="auto"/>
-        </w:rPr>
-      </w:r>
-      <w:r/>
-      <w:r>
-        <w:rPr>
-          <w:rStyle w:val="fontstyle01"/>
-          <w:rFonts w:eastAsiaTheme="majorEastAsia"/>
-          <w:color w:val="auto"/>
-        </w:rPr>
-      </w:r>
     </w:p>
     <w:p>
       <w:pPr>
         <w:ind w:left="1440"/>
       </w:pPr>
-      <w:r>
-        <w:rPr>
-          <w:rStyle w:val="fontstyle01"/>
-          <w:color w:val="auto"/>
-        </w:rPr>
-      </w:r>
-      <w:r>
-        <w:rPr>
-          <w:rStyle w:val="fontstyle01"/>
-          <w:rFonts w:eastAsiaTheme="majorEastAsia"/>
-          <w:color w:val="auto"/>
-        </w:rPr>
-      </w:r>
-      <w:r>
-        <w:rPr>
-          <w:rStyle w:val="fontstyle01"/>
-          <w:rFonts w:eastAsiaTheme="majorEastAsia"/>
-          <w:color w:val="auto"/>
-        </w:rPr>
-      </w:r>
-      <w:r>
-        <w:rPr>
-          <w:rStyle w:val="fontstyle01"/>
-          <w:rFonts w:eastAsiaTheme="majorEastAsia"/>
-          <w:color w:val="auto"/>
-        </w:rPr>
-      </w:r>
-      <w:r/>
-      <w:r>
-        <w:rPr>
-          <w:rStyle w:val="fontstyle01"/>
-          <w:rFonts w:eastAsiaTheme="majorEastAsia"/>
-          <w:color w:val="auto"/>
-        </w:rPr>
-      </w:r>
-      <w:r>
-        <w:rPr>
-          <w:rStyle w:val="fontstyle01"/>
-          <w:rFonts w:eastAsiaTheme="majorEastAsia"/>
-          <w:color w:val="auto"/>
-        </w:rPr>
-      </w:r>
-      <w:r/>
-      <w:r>
-        <w:rPr>
-          <w:rStyle w:val="fontstyle01"/>
-          <w:rFonts w:eastAsiaTheme="majorEastAsia"/>
-          <w:color w:val="auto"/>
-        </w:rPr>
-      </w:r>
-      <w:r>
-        <w:rPr>
-          <w:rStyle w:val="fontstyle01"/>
-          <w:rFonts w:eastAsiaTheme="majorEastAsia"/>
-          <w:color w:val="auto"/>
-        </w:rPr>
-      </w:r>
-      <w:r>
-        <w:rPr>
-          <w:rStyle w:val="fontstyle01"/>
-          <w:rFonts w:eastAsiaTheme="majorEastAsia"/>
-          <w:color w:val="auto"/>
-        </w:rPr>
-      </w:r>
-      <w:r/>
-      <w:r>
-        <w:rPr>
-          <w:rStyle w:val="fontstyle01"/>
-          <w:rFonts w:eastAsiaTheme="majorEastAsia"/>
-          <w:color w:val="auto"/>
-        </w:rPr>
-      </w:r>
-      <w:r>
-        <w:rPr>
-          <w:rStyle w:val="fontstyle01"/>
-          <w:rFonts w:eastAsiaTheme="majorEastAsia"/>
-          <w:color w:val="auto"/>
-        </w:rPr>
-      </w:r>
-      <w:r/>
-      <w:r>
-        <w:rPr>
-          <w:rStyle w:val="fontstyle01"/>
-          <w:rFonts w:eastAsiaTheme="majorEastAsia"/>
-          <w:color w:val="auto"/>
-        </w:rPr>
-      </w:r>
       <w:r>
         <w:t>{{recommendation_redo_log}}</w:t>
       </w:r>
@@ -7162,7 +6727,7 @@
           <w:lang w:val="en-US"/>
         </w:rPr>
       </w:pPr>
-      <w:bookmarkStart w:id="24" w:name="_Toc170980839"/>
+      <w:bookmarkStart w:id="23" w:name="_Toc170980839"/>
       <w:r>
         <w:rPr>
           <w:color w:val="auto"/>
@@ -7170,7 +6735,7 @@
         </w:rPr>
         <w:t>TẦN SUẤT LOG SWITCH</w:t>
       </w:r>
-      <w:bookmarkEnd w:id="24"/>
+      <w:bookmarkEnd w:id="23"/>
     </w:p>
     <w:p>
       <w:r>
@@ -7184,15 +6749,9 @@
           <w:lang w:eastAsia="x-none"/>
         </w:rPr>
       </w:pPr>
-      <w:bookmarkStart w:id="25" w:name="_Hlk144385172"/>
-      <w:r>
-        <w:rPr>
-          <w:noProof/>
-          <w:lang w:eastAsia="x-none"/>
-        </w:rPr>
-      </w:r>
-    </w:p>
-    <w:bookmarkEnd w:id="25"/>
+      <w:bookmarkStart w:id="24" w:name="_Hlk144385172"/>
+    </w:p>
+    <w:bookmarkEnd w:id="24"/>
     <w:p>
       <w:pPr>
         <w:jc w:val="center"/>
@@ -7217,13 +6776,6 @@
           <w:lang w:eastAsia="x-none"/>
         </w:rPr>
       </w:pPr>
-      <w:r>
-        <w:rPr>
-          <w:noProof/>
-          <w:lang w:eastAsia="x-none"/>
-        </w:rPr>
-        <w:lastRenderedPageBreak/>
-      </w:r>
     </w:p>
     <w:p>
       <w:pPr>
@@ -7470,14 +7022,14 @@
       <w:pPr>
         <w:pStyle w:val="Heading3"/>
       </w:pPr>
-      <w:bookmarkStart w:id="26" w:name="_Toc170980840"/>
+      <w:bookmarkStart w:id="25" w:name="_Toc170980840"/>
       <w:r>
         <w:t xml:space="preserve">CẤU HÌNH </w:t>
       </w:r>
       <w:r>
         <w:t>LƯU TRỮ</w:t>
       </w:r>
-      <w:bookmarkEnd w:id="26"/>
+      <w:bookmarkEnd w:id="25"/>
     </w:p>
     <w:p>
       <w:pPr>
@@ -7496,7 +7048,7 @@
           <w:lang w:val="en-US"/>
         </w:rPr>
       </w:pPr>
-      <w:bookmarkStart w:id="27" w:name="_Toc170980841"/>
+      <w:bookmarkStart w:id="26" w:name="_Toc170980841"/>
       <w:r>
         <w:rPr>
           <w:color w:val="auto"/>
@@ -7511,7 +7063,7 @@
         </w:rPr>
         <w:t>DISK GROUP</w:t>
       </w:r>
-      <w:bookmarkEnd w:id="27"/>
+      <w:bookmarkEnd w:id="26"/>
     </w:p>
     <w:p>
       <w:pPr>
@@ -7560,7 +7112,7 @@
           <w:lang w:val="en-US"/>
         </w:rPr>
       </w:pPr>
-      <w:bookmarkStart w:id="28" w:name="_Toc170980842"/>
+      <w:bookmarkStart w:id="27" w:name="_Toc170980842"/>
       <w:r>
         <w:rPr>
           <w:color w:val="auto"/>
@@ -7569,7 +7121,7 @@
         <w:lastRenderedPageBreak/>
         <w:t>DATA FILE</w:t>
       </w:r>
-      <w:bookmarkEnd w:id="28"/>
+      <w:bookmarkEnd w:id="27"/>
       <w:r>
         <w:rPr>
           <w:color w:val="auto"/>
@@ -7590,8 +7142,8 @@
           <w:rFonts w:eastAsia="Cambria"/>
         </w:rPr>
         <w:sectPr>
-          <w:headerReference w:type="default" r:id="rId15"/>
-          <w:footerReference w:type="default" r:id="rId16"/>
+          <w:headerReference w:type="default" r:id="rId13"/>
+          <w:footerReference w:type="default" r:id="rId14"/>
           <w:pgSz w:w="16834" w:h="11909" w:orient="landscape" w:code="9"/>
           <w:pgMar w:top="1699" w:right="1411" w:bottom="839" w:left="1440" w:header="562" w:footer="432" w:gutter="0"/>
           <w:cols w:space="720"/>
@@ -7622,7 +7174,7 @@
           <w:lang w:val="en-US"/>
         </w:rPr>
       </w:pPr>
-      <w:bookmarkStart w:id="29" w:name="_Toc170980843"/>
+      <w:bookmarkStart w:id="28" w:name="_Toc170980843"/>
       <w:r>
         <w:rPr>
           <w:color w:val="auto"/>
@@ -7631,7 +7183,7 @@
         <w:lastRenderedPageBreak/>
         <w:t>MỨC ĐỘ SỬ DỤNG TABLESPACES</w:t>
       </w:r>
-      <w:bookmarkEnd w:id="29"/>
+      <w:bookmarkEnd w:id="28"/>
     </w:p>
     <w:p>
       <w:r>
@@ -7665,17 +7217,11 @@
         </w:rPr>
         <w:t>{{assessment_tablespace_usage}}</w:t>
       </w:r>
-      <w:r/>
     </w:p>
     <w:p>
       <w:pPr>
         <w:ind w:left="1080"/>
       </w:pPr>
-      <w:r>
-        <w:rPr>
-          <w:rFonts w:eastAsia="Cambria" w:cs="Cambria"/>
-        </w:rPr>
-      </w:r>
     </w:p>
     <w:p>
       <w:pPr>
@@ -7738,51 +7284,51 @@
         </w:tabs>
         <w:ind w:left="720" w:hanging="216"/>
       </w:pPr>
-      <w:bookmarkStart w:id="30" w:name="_Toc526326188"/>
-      <w:bookmarkStart w:id="31" w:name="_Toc170980844"/>
+      <w:bookmarkStart w:id="29" w:name="_Toc526326188"/>
+      <w:bookmarkStart w:id="30" w:name="_Toc170980844"/>
       <w:r>
         <w:lastRenderedPageBreak/>
         <w:t>DATA GUARD</w:t>
       </w:r>
+      <w:bookmarkEnd w:id="29"/>
       <w:bookmarkEnd w:id="30"/>
+    </w:p>
+    <w:p>
+      <w:pPr>
+        <w:pStyle w:val="Heading3"/>
+      </w:pPr>
+      <w:bookmarkStart w:id="31" w:name="_Toc526326189"/>
+      <w:bookmarkStart w:id="32" w:name="_Toc170980845"/>
+      <w:r>
+        <w:t>PARAMETERS</w:t>
+      </w:r>
       <w:bookmarkEnd w:id="31"/>
+      <w:bookmarkEnd w:id="32"/>
+    </w:p>
+    <w:p>
+      <w:pPr>
+        <w:rPr>
+          <w:rFonts w:cs="Arial"/>
+        </w:rPr>
+      </w:pPr>
     </w:p>
     <w:p>
       <w:pPr>
         <w:pStyle w:val="Heading3"/>
       </w:pPr>
-      <w:bookmarkStart w:id="32" w:name="_Toc526326189"/>
-      <w:bookmarkStart w:id="33" w:name="_Toc170980845"/>
-      <w:r>
-        <w:t>PARAMETERS</w:t>
-      </w:r>
-      <w:bookmarkEnd w:id="32"/>
+      <w:bookmarkStart w:id="33" w:name="_Toc526326190"/>
+      <w:bookmarkStart w:id="34" w:name="_Toc170980846"/>
+      <w:r>
+        <w:t>ARCHIVE DESTINATION STATUS</w:t>
+      </w:r>
       <w:bookmarkEnd w:id="33"/>
-    </w:p>
-    <w:p>
-      <w:pPr>
-        <w:rPr>
-          <w:rFonts w:cs="Arial"/>
-        </w:rPr>
-      </w:pPr>
-    </w:p>
-    <w:p>
-      <w:pPr>
-        <w:pStyle w:val="Heading3"/>
-      </w:pPr>
-      <w:bookmarkStart w:id="34" w:name="_Toc526326190"/>
-      <w:bookmarkStart w:id="35" w:name="_Toc170980846"/>
-      <w:r>
-        <w:t>ARCHIVE DESTINATION STATUS</w:t>
-      </w:r>
       <w:bookmarkEnd w:id="34"/>
-      <w:bookmarkEnd w:id="35"/>
     </w:p>
     <w:p>
       <w:pPr>
         <w:pStyle w:val="09Bodytext"/>
       </w:pPr>
-      <w:bookmarkStart w:id="36" w:name="_Toc170980847"/>
+      <w:bookmarkStart w:id="35" w:name="_Toc170980847"/>
       <w:r>
         <w:t>&lt;archive_destinations&gt;</w:t>
       </w:r>
@@ -7795,14 +7341,35 @@
       <w:r>
         <w:t>STANDBY DEST</w:t>
       </w:r>
+      <w:bookmarkEnd w:id="35"/>
+    </w:p>
+    <w:p>
+      <w:pPr>
+        <w:pStyle w:val="09Bodytext"/>
+      </w:pPr>
+      <w:r>
+        <w:t>&lt;standby_dest&gt;</w:t>
+      </w:r>
+    </w:p>
+    <w:p/>
+    <w:p>
+      <w:pPr>
+        <w:pStyle w:val="Heading3"/>
+      </w:pPr>
+      <w:r>
+        <w:t>STANDBY REDO LOG</w:t>
+      </w:r>
+    </w:p>
+    <w:p>
+      <w:pPr>
+        <w:pStyle w:val="Heading3"/>
+      </w:pPr>
+      <w:bookmarkStart w:id="36" w:name="_Toc526326191"/>
+      <w:bookmarkStart w:id="37" w:name="_Toc170980848"/>
       <w:bookmarkEnd w:id="36"/>
-    </w:p>
-    <w:p>
-      <w:pPr>
-        <w:pStyle w:val="09Bodytext"/>
-      </w:pPr>
-      <w:r>
-        <w:t>&lt;standby_dest&gt;</w:t>
+      <w:bookmarkEnd w:id="37"/>
+      <w:r>
+        <w:t>&lt;standby_logs&gt;</w:t>
       </w:r>
     </w:p>
     <w:p/>
@@ -7810,37 +7377,11 @@
       <w:pPr>
         <w:pStyle w:val="Heading3"/>
       </w:pPr>
-      <w:bookmarkStart w:id="37" w:name="_Toc526326191"/>
-      <w:bookmarkStart w:id="38" w:name="_Toc170980848"/>
-      <w:r>
-        <w:t>STANDBY REDO LOG</w:t>
-      </w:r>
-      <w:bookmarkEnd w:id="37"/>
+      <w:bookmarkStart w:id="38" w:name="_Toc170980849"/>
+      <w:r>
+        <w:t>CURRENT AND LAST SEQ</w:t>
+      </w:r>
       <w:bookmarkEnd w:id="38"/>
-    </w:p>
-    <w:p>
-      <w:pPr>
-        <w:pStyle w:val="Heading3"/>
-      </w:pPr>
-      <w:bookmarkStart w:id="37" w:name="_Toc526326191"/>
-      <w:bookmarkStart w:id="38" w:name="_Toc170980848"/>
-      <w:r/>
-      <w:bookmarkEnd w:id="37"/>
-      <w:bookmarkEnd w:id="38"/>
-      <w:r>
-        <w:t>&lt;standby_logs&gt;</w:t>
-      </w:r>
-    </w:p>
-    <w:p/>
-    <w:p>
-      <w:pPr>
-        <w:pStyle w:val="Heading3"/>
-      </w:pPr>
-      <w:bookmarkStart w:id="39" w:name="_Toc170980849"/>
-      <w:r>
-        <w:t>CURRENT AND LAST SEQ</w:t>
-      </w:r>
-      <w:bookmarkEnd w:id="39"/>
     </w:p>
     <w:p>
       <w:pPr>
@@ -7887,28 +7428,28 @@
       <w:pPr>
         <w:pStyle w:val="Heading1"/>
       </w:pPr>
-      <w:bookmarkStart w:id="40" w:name="_Toc170980850"/>
+      <w:bookmarkStart w:id="39" w:name="_Toc170980850"/>
       <w:r>
         <w:lastRenderedPageBreak/>
         <w:t>QUẢN LÝ DATABASE</w:t>
       </w:r>
+      <w:bookmarkEnd w:id="39"/>
+    </w:p>
+    <w:p>
+      <w:pPr>
+        <w:pStyle w:val="Heading2"/>
+      </w:pPr>
+      <w:bookmarkStart w:id="40" w:name="_Toc170980851"/>
+      <w:r>
+        <w:t xml:space="preserve">CÁC </w:t>
+      </w:r>
+      <w:r>
+        <w:t xml:space="preserve">TABLE KHÔNG CÓ </w:t>
+      </w:r>
+      <w:r>
+        <w:t>INDEX</w:t>
+      </w:r>
       <w:bookmarkEnd w:id="40"/>
-    </w:p>
-    <w:p>
-      <w:pPr>
-        <w:pStyle w:val="Heading2"/>
-      </w:pPr>
-      <w:bookmarkStart w:id="41" w:name="_Toc170980851"/>
-      <w:r>
-        <w:t xml:space="preserve">CÁC </w:t>
-      </w:r>
-      <w:r>
-        <w:t xml:space="preserve">TABLE KHÔNG CÓ </w:t>
-      </w:r>
-      <w:r>
-        <w:t>INDEX</w:t>
-      </w:r>
-      <w:bookmarkEnd w:id="41"/>
     </w:p>
     <w:p>
       <w:r>
@@ -7961,16 +7502,6 @@
         </w:rPr>
         <w:t>{{assessment_no_index}}</w:t>
       </w:r>
-      <w:r>
-        <w:rPr>
-          <w:iCs/>
-        </w:rPr>
-      </w:r>
-      <w:r>
-        <w:rPr>
-          <w:iCs/>
-        </w:rPr>
-      </w:r>
     </w:p>
     <w:p>
       <w:pPr>
@@ -8029,34 +7560,19 @@
         </w:rPr>
         <w:t>{{recommendation_no_index}}</w:t>
       </w:r>
-      <w:r>
-        <w:rPr>
-          <w:bCs/>
-        </w:rPr>
-      </w:r>
-      <w:r>
-        <w:rPr>
-          <w:bCs/>
-        </w:rPr>
-      </w:r>
-      <w:r>
-        <w:rPr>
-          <w:bCs/>
-        </w:rPr>
-      </w:r>
     </w:p>
     <w:p>
       <w:pPr>
         <w:pStyle w:val="Heading2"/>
       </w:pPr>
-      <w:bookmarkStart w:id="42" w:name="_Toc170980852"/>
+      <w:bookmarkStart w:id="41" w:name="_Toc170980852"/>
       <w:r>
         <w:t xml:space="preserve">CÁC </w:t>
       </w:r>
       <w:r>
         <w:t>TABLE KHÔNG CÓ KHOÁ CHÍNH</w:t>
       </w:r>
-      <w:bookmarkEnd w:id="42"/>
+      <w:bookmarkEnd w:id="41"/>
     </w:p>
     <w:p>
       <w:r>
@@ -8099,16 +7615,6 @@
         </w:rPr>
         <w:t>{{assessment_no_pk}}</w:t>
       </w:r>
-      <w:r>
-        <w:rPr>
-          <w:iCs/>
-        </w:rPr>
-      </w:r>
-      <w:r>
-        <w:rPr>
-          <w:iCs/>
-        </w:rPr>
-      </w:r>
     </w:p>
     <w:p>
       <w:pPr>
@@ -8154,21 +7660,6 @@
         </w:rPr>
         <w:t>{{recommendation_no_pk}}</w:t>
       </w:r>
-      <w:r>
-        <w:rPr>
-          <w:iCs/>
-        </w:rPr>
-      </w:r>
-      <w:r>
-        <w:rPr>
-          <w:iCs/>
-        </w:rPr>
-      </w:r>
-      <w:r>
-        <w:rPr>
-          <w:iCs/>
-        </w:rPr>
-      </w:r>
     </w:p>
     <w:p>
       <w:pPr>
@@ -8188,12 +7679,12 @@
       <w:pPr>
         <w:pStyle w:val="Heading2"/>
       </w:pPr>
-      <w:bookmarkStart w:id="43" w:name="_Toc170980853"/>
+      <w:bookmarkStart w:id="42" w:name="_Toc170980853"/>
       <w:r>
         <w:lastRenderedPageBreak/>
         <w:t>INVALID OBJECT</w:t>
       </w:r>
-      <w:bookmarkEnd w:id="43"/>
+      <w:bookmarkEnd w:id="42"/>
     </w:p>
     <w:p>
       <w:r>
@@ -8230,16 +7721,6 @@
           <w:iCs/>
         </w:rPr>
         <w:t>{{assessment_invalid_objects}}</w:t>
-      </w:r>
-      <w:r>
-        <w:rPr>
-          <w:iCs/>
-        </w:rPr>
-      </w:r>
-      <w:r>
-        <w:rPr>
-          <w:iCs/>
-        </w:rPr>
       </w:r>
     </w:p>
     <w:p>
@@ -8279,13 +7760,6 @@
           <w:iCs/>
         </w:rPr>
         <w:t>{{recommendation_invalid_objects}}</w:t>
-      </w:r>
-      <w:r>
-        <w:rPr>
-          <w:b/>
-          <w:iCs/>
-          <w:color w:val="000000"/>
-        </w:rPr>
       </w:r>
     </w:p>
     <w:p>
@@ -8311,14 +7785,14 @@
       <w:pPr>
         <w:pStyle w:val="Heading2"/>
       </w:pPr>
-      <w:bookmarkStart w:id="44" w:name="_Toc44319291"/>
-      <w:bookmarkStart w:id="45" w:name="_Toc170980854"/>
+      <w:bookmarkStart w:id="43" w:name="_Toc44319291"/>
+      <w:bookmarkStart w:id="44" w:name="_Toc170980854"/>
       <w:r>
         <w:lastRenderedPageBreak/>
         <w:t>DATABASE JOBS</w:t>
       </w:r>
+      <w:bookmarkEnd w:id="43"/>
       <w:bookmarkEnd w:id="44"/>
-      <w:bookmarkEnd w:id="45"/>
     </w:p>
     <w:p>
       <w:pPr>
@@ -8354,9 +7828,9 @@
           <w:color w:val="000000"/>
         </w:rPr>
       </w:pPr>
-      <w:bookmarkStart w:id="46" w:name="_Hlk144385341"/>
-    </w:p>
-    <w:bookmarkEnd w:id="46"/>
+      <w:bookmarkStart w:id="45" w:name="_Hlk144385341"/>
+    </w:p>
+    <w:bookmarkEnd w:id="45"/>
     <w:p>
       <w:pPr>
         <w:pStyle w:val="ListParagraph"/>
@@ -8378,6 +7852,56 @@
     <w:p>
       <w:r>
         <w:t>&lt;sche_job&gt;</w:t>
+      </w:r>
+    </w:p>
+    <w:p>
+      <w:pPr>
+        <w:pStyle w:val="ListParagraph"/>
+        <w:numPr>
+          <w:ilvl w:val="0"/>
+          <w:numId w:val="12"/>
+        </w:numPr>
+        <w:rPr>
+          <w:b/>
+          <w:bCs/>
+        </w:rPr>
+      </w:pPr>
+      <w:r>
+        <w:rPr>
+          <w:b/>
+          <w:bCs/>
+        </w:rPr>
+        <w:t>Scheduler Window Group Members</w:t>
+      </w:r>
+    </w:p>
+    <w:p>
+      <w:r>
+        <w:t>&lt;scheduler_window_group_members&gt;</w:t>
+      </w:r>
+    </w:p>
+    <w:p>
+      <w:pPr>
+        <w:pStyle w:val="ListParagraph"/>
+        <w:numPr>
+          <w:ilvl w:val="0"/>
+          <w:numId w:val="12"/>
+        </w:numPr>
+        <w:rPr>
+          <w:b/>
+          <w:bCs/>
+        </w:rPr>
+      </w:pPr>
+      <w:r>
+        <w:rPr>
+          <w:b/>
+          <w:bCs/>
+        </w:rPr>
+        <w:t>Scheduler Windows</w:t>
+      </w:r>
+    </w:p>
+    <w:p>
+      <w:r>
+        <w:t>&lt;scheduler_windows&gt;</w:t>
       </w:r>
     </w:p>
     <w:p>
@@ -8404,7 +7928,7 @@
         <w:lastRenderedPageBreak/>
         <w:t xml:space="preserve"> </w:t>
       </w:r>
-      <w:bookmarkStart w:id="47" w:name="_Toc170980855"/>
+      <w:bookmarkStart w:id="46" w:name="_Toc170980855"/>
       <w:r>
         <w:t xml:space="preserve">TABLE </w:t>
       </w:r>
@@ -8423,7 +7947,7 @@
       <w:r>
         <w:t xml:space="preserve"> CŨ</w:t>
       </w:r>
-      <w:bookmarkEnd w:id="47"/>
+      <w:bookmarkEnd w:id="46"/>
     </w:p>
     <w:p>
       <w:pPr>
@@ -8454,9 +7978,9 @@
           <w:bCs/>
         </w:rPr>
       </w:pPr>
-      <w:bookmarkStart w:id="48" w:name="_Hlk144385423"/>
-    </w:p>
-    <w:bookmarkEnd w:id="48"/>
+      <w:bookmarkStart w:id="47" w:name="_Hlk144385423"/>
+    </w:p>
+    <w:bookmarkEnd w:id="47"/>
     <w:p>
       <w:pPr>
         <w:pStyle w:val="ListParagraph"/>
@@ -8520,16 +8044,6 @@
         </w:rPr>
         <w:t>{{assessment_stale_stats}}</w:t>
       </w:r>
-      <w:r>
-        <w:rPr>
-          <w:iCs/>
-        </w:rPr>
-      </w:r>
-      <w:r>
-        <w:rPr>
-          <w:iCs/>
-        </w:rPr>
-      </w:r>
     </w:p>
     <w:p>
       <w:pPr>
@@ -8569,29 +8083,18 @@
         </w:rPr>
         <w:t>{{recommendation_stale_stats}}</w:t>
       </w:r>
-      <w:r>
-        <w:rPr>
-          <w:iCs/>
-        </w:rPr>
-      </w:r>
-      <w:r>
+    </w:p>
+    <w:p>
+      <w:pPr>
+        <w:spacing w:before="0" w:after="160" w:line="259" w:lineRule="auto"/>
         <w:rPr>
           <w:b/>
-          <w:iCs/>
-        </w:rPr>
-      </w:r>
-    </w:p>
-    <w:p>
-      <w:pPr>
-        <w:spacing w:before="0" w:after="160" w:line="259" w:lineRule="auto"/>
+        </w:rPr>
+      </w:pPr>
+      <w:r>
         <w:rPr>
           <w:b/>
         </w:rPr>
-      </w:pPr>
-      <w:r>
-        <w:rPr>
-          <w:b/>
-        </w:rPr>
         <w:br w:type="page"/>
       </w:r>
     </w:p>
@@ -8599,34 +8102,34 @@
       <w:pPr>
         <w:pStyle w:val="Heading1"/>
       </w:pPr>
-      <w:bookmarkStart w:id="49" w:name="_Toc170980856"/>
+      <w:bookmarkStart w:id="48" w:name="_Toc170980856"/>
       <w:r>
         <w:lastRenderedPageBreak/>
         <w:t>ĐÁNH GIÁ HIỆU SUẤT HOẠT ĐỘNG</w:t>
       </w:r>
+      <w:bookmarkEnd w:id="48"/>
+    </w:p>
+    <w:p>
+      <w:pPr>
+        <w:pStyle w:val="Heading2"/>
+      </w:pPr>
+      <w:bookmarkStart w:id="49" w:name="_Toc170980857"/>
+      <w:r>
+        <w:t>TỔNG QUAN VỀ HOẠT ĐỘNG CỦA HỆ THỐNG</w:t>
+      </w:r>
       <w:bookmarkEnd w:id="49"/>
     </w:p>
     <w:p>
       <w:pPr>
-        <w:pStyle w:val="Heading2"/>
-      </w:pPr>
-      <w:bookmarkStart w:id="50" w:name="_Toc170980857"/>
-      <w:r>
-        <w:t>TỔNG QUAN VỀ HOẠT ĐỘNG CỦA HỆ THỐNG</w:t>
+        <w:pStyle w:val="Heading3"/>
+      </w:pPr>
+      <w:bookmarkStart w:id="50" w:name="_Toc502846929"/>
+      <w:bookmarkStart w:id="51" w:name="_Toc170980858"/>
+      <w:r>
+        <w:t>ACTIVE SESSION</w:t>
       </w:r>
       <w:bookmarkEnd w:id="50"/>
-    </w:p>
-    <w:p>
-      <w:pPr>
-        <w:pStyle w:val="Heading3"/>
-      </w:pPr>
-      <w:bookmarkStart w:id="51" w:name="_Toc502846929"/>
-      <w:bookmarkStart w:id="52" w:name="_Toc170980858"/>
-      <w:r>
-        <w:t>ACTIVE SESSION</w:t>
-      </w:r>
       <w:bookmarkEnd w:id="51"/>
-      <w:bookmarkEnd w:id="52"/>
       <w:r>
         <w:t xml:space="preserve"> </w:t>
       </w:r>
@@ -8655,14 +8158,9 @@
       </w:r>
     </w:p>
     <w:p>
-      <w:bookmarkStart w:id="53" w:name="_Hlk144385462"/>
-      <w:r>
-        <w:rPr>
-          <w:noProof/>
-        </w:rPr>
-      </w:r>
-    </w:p>
-    <w:bookmarkEnd w:id="53"/>
+      <w:bookmarkStart w:id="52" w:name="_Hlk144385462"/>
+    </w:p>
+    <w:bookmarkEnd w:id="52"/>
     <w:p>
       <w:pPr>
         <w:pStyle w:val="ListParagraph"/>
@@ -8672,23 +8170,12 @@
           <w:noProof/>
         </w:rPr>
       </w:pPr>
-      <w:r>
-        <w:rPr>
-          <w:i/>
-          <w:u w:val="single"/>
-        </w:rPr>
-      </w:r>
     </w:p>
     <w:p>
       <w:pPr>
         <w:pStyle w:val="ListParagraph"/>
         <w:ind w:hanging="720"/>
       </w:pPr>
-      <w:r>
-        <w:rPr>
-          <w:noProof/>
-        </w:rPr>
-      </w:r>
     </w:p>
     <w:p>
       <w:pPr>
@@ -8698,34 +8185,6 @@
           <w:b/>
         </w:rPr>
       </w:pPr>
-      <w:r>
-        <w:rPr>
-          <w:i/>
-          <w:u w:val="single"/>
-        </w:rPr>
-      </w:r>
-      <w:r>
-        <w:rPr>
-          <w:i/>
-          <w:u w:val="single"/>
-        </w:rPr>
-      </w:r>
-      <w:r>
-        <w:rPr>
-          <w:i/>
-          <w:u w:val="single"/>
-        </w:rPr>
-      </w:r>
-      <w:r>
-        <w:rPr>
-          <w:b/>
-        </w:rPr>
-      </w:r>
-      <w:r>
-        <w:rPr>
-          <w:b/>
-        </w:rPr>
-      </w:r>
     </w:p>
     <w:p>
       <w:pPr>
@@ -8740,7 +8199,6 @@
         <w:rPr>
           <w:b/>
         </w:rPr>
-        <w:lastRenderedPageBreak/>
         <w:t>WAIT EVENT</w:t>
       </w:r>
     </w:p>
@@ -8754,11 +8212,6 @@
         <w:pStyle w:val="ListParagraph"/>
         <w:ind w:hanging="720"/>
       </w:pPr>
-      <w:r>
-        <w:rPr>
-          <w:noProof/>
-        </w:rPr>
-      </w:r>
     </w:p>
     <w:p>
       <w:pPr>
@@ -8768,58 +8221,23 @@
           <w:u w:val="single"/>
         </w:rPr>
       </w:pPr>
-      <w:r>
+    </w:p>
+    <w:p>
+      <w:pPr>
+        <w:jc w:val="center"/>
+        <w:rPr>
+          <w:noProof/>
+        </w:rPr>
+      </w:pPr>
+    </w:p>
+    <w:p>
+      <w:pPr>
+        <w:jc w:val="center"/>
         <w:rPr>
           <w:i/>
           <w:u w:val="single"/>
         </w:rPr>
-      </w:r>
-    </w:p>
-    <w:p>
-      <w:pPr>
-        <w:jc w:val="center"/>
-        <w:rPr>
-          <w:noProof/>
-        </w:rPr>
-      </w:pPr>
-      <w:r>
-        <w:rPr>
-          <w:noProof/>
-        </w:rPr>
-      </w:r>
-    </w:p>
-    <w:p>
-      <w:pPr>
-        <w:jc w:val="center"/>
-        <w:rPr>
-          <w:i/>
-          <w:u w:val="single"/>
-        </w:rPr>
-      </w:pPr>
-      <w:r>
-        <w:rPr>
-          <w:i/>
-          <w:u w:val="single"/>
-        </w:rPr>
-      </w:r>
-      <w:r>
-        <w:rPr>
-          <w:i/>
-          <w:u w:val="single"/>
-        </w:rPr>
-      </w:r>
-      <w:r>
-        <w:rPr>
-          <w:i/>
-          <w:u w:val="single"/>
-        </w:rPr>
-      </w:r>
-      <w:r>
-        <w:rPr>
-          <w:i/>
-          <w:u w:val="single"/>
-        </w:rPr>
-      </w:r>
+      </w:pPr>
     </w:p>
     <w:p>
       <w:pPr>
@@ -8840,12 +8258,12 @@
       <w:pPr>
         <w:pStyle w:val="Heading3"/>
       </w:pPr>
-      <w:bookmarkStart w:id="54" w:name="_Toc170980859"/>
+      <w:bookmarkStart w:id="53" w:name="_Toc170980859"/>
       <w:r>
         <w:lastRenderedPageBreak/>
         <w:t>CÁC CÂU LỆNH TỐN NHIỀU DB TIME</w:t>
       </w:r>
-      <w:bookmarkEnd w:id="54"/>
+      <w:bookmarkEnd w:id="53"/>
     </w:p>
     <w:p>
       <w:pPr>
@@ -8864,44 +8282,9 @@
         </w:rPr>
         <w:t>Tổng hợp của {{history_days}} ngày đánh giá ({{report_period}})</w:t>
       </w:r>
-      <w:r>
-        <w:rPr>
-          <w:b/>
-        </w:rPr>
-      </w:r>
-      <w:r>
-        <w:rPr>
-          <w:b/>
-        </w:rPr>
-      </w:r>
-      <w:r>
-        <w:rPr>
-          <w:b/>
-        </w:rPr>
-      </w:r>
-      <w:r>
-        <w:rPr>
-          <w:b/>
-        </w:rPr>
-      </w:r>
-      <w:r>
-        <w:rPr>
-          <w:b/>
-        </w:rPr>
-      </w:r>
-      <w:r>
-        <w:rPr>
-          <w:b/>
-        </w:rPr>
-      </w:r>
-      <w:r>
-        <w:rPr>
-          <w:b/>
-        </w:rPr>
-      </w:r>
-    </w:p>
-    <w:p>
-      <w:bookmarkStart w:id="55" w:name="_Hlk144385488"/>
+    </w:p>
+    <w:p>
+      <w:bookmarkStart w:id="54" w:name="_Hlk144385488"/>
       <w:r>
         <w:t>&lt;ash_top_sql_charts&gt;</w:t>
       </w:r>
@@ -8912,7 +8295,7 @@
       </w:r>
     </w:p>
     <w:p/>
-    <w:bookmarkEnd w:id="55"/>
+    <w:bookmarkEnd w:id="54"/>
     <w:p>
       <w:pPr>
         <w:jc w:val="center"/>
@@ -8956,36 +8339,33 @@
       </w:pPr>
     </w:p>
     <w:p>
-      <w:bookmarkStart w:id="56" w:name="_Hlk144385513"/>
+      <w:bookmarkStart w:id="55" w:name="_Hlk144385513"/>
     </w:p>
     <w:p>
       <w:pPr>
         <w:pStyle w:val="Heading2"/>
       </w:pPr>
-      <w:bookmarkStart w:id="57" w:name="_Toc170980860"/>
+      <w:bookmarkStart w:id="56" w:name="_Toc170980860"/>
+      <w:bookmarkEnd w:id="55"/>
+      <w:r>
+        <w:t>HIỆU SUẤT CPU</w:t>
+      </w:r>
       <w:bookmarkEnd w:id="56"/>
-      <w:r>
-        <w:t>HIỆU SUẤT CPU</w:t>
-      </w:r>
+    </w:p>
+    <w:p>
+      <w:pPr>
+        <w:pStyle w:val="Heading3"/>
+      </w:pPr>
+      <w:r>
+        <w:t>ORACLE FOREGROUND PROCESS</w:t>
+      </w:r>
+    </w:p>
+    <w:p>
+      <w:pPr>
+        <w:pStyle w:val="Heading3"/>
+      </w:pPr>
+      <w:bookmarkStart w:id="57" w:name="_Toc170980861"/>
       <w:bookmarkEnd w:id="57"/>
-    </w:p>
-    <w:p>
-      <w:pPr>
-        <w:pStyle w:val="Heading3"/>
-      </w:pPr>
-      <w:bookmarkStart w:id="58" w:name="_Toc170980861"/>
-      <w:r>
-        <w:t>ORACLE FOREGROUND PROCESS</w:t>
-      </w:r>
-      <w:bookmarkEnd w:id="58"/>
-    </w:p>
-    <w:p>
-      <w:pPr>
-        <w:pStyle w:val="Heading3"/>
-      </w:pPr>
-      <w:bookmarkStart w:id="58" w:name="_Toc170980861"/>
-      <w:r/>
-      <w:bookmarkEnd w:id="58"/>
       <w:r>
         <w:t>&lt;cpu_busy_idle_charts&gt;</w:t>
       </w:r>
@@ -8996,14 +8376,9 @@
           <w:noProof/>
         </w:rPr>
       </w:pPr>
-      <w:bookmarkStart w:id="59" w:name="_Hlk144385532"/>
-      <w:r>
-        <w:rPr>
-          <w:noProof/>
-        </w:rPr>
-      </w:r>
-    </w:p>
-    <w:bookmarkEnd w:id="59"/>
+      <w:bookmarkStart w:id="58" w:name="_Hlk144385532"/>
+    </w:p>
+    <w:bookmarkEnd w:id="58"/>
     <w:p>
       <w:pPr>
         <w:ind w:left="720" w:hanging="720"/>
@@ -9012,26 +8387,14 @@
           <w:noProof/>
         </w:rPr>
       </w:pPr>
-      <w:r>
-        <w:rPr>
-          <w:i/>
+    </w:p>
+    <w:p>
+      <w:pPr>
+        <w:ind w:left="720" w:hanging="720"/>
+        <w:rPr>
           <w:noProof/>
-          <w:u w:val="single"/>
-        </w:rPr>
-      </w:r>
-    </w:p>
-    <w:p>
-      <w:pPr>
-        <w:ind w:left="720" w:hanging="720"/>
-        <w:rPr>
-          <w:noProof/>
-        </w:rPr>
-      </w:pPr>
-      <w:r>
-        <w:rPr>
-          <w:noProof/>
-        </w:rPr>
-      </w:r>
+        </w:rPr>
+      </w:pPr>
     </w:p>
     <w:p>
       <w:pPr>
@@ -9041,27 +8404,6 @@
           <w:noProof/>
         </w:rPr>
       </w:pPr>
-      <w:r>
-        <w:rPr>
-          <w:i/>
-          <w:noProof/>
-          <w:u w:val="single"/>
-        </w:rPr>
-      </w:r>
-      <w:r>
-        <w:rPr>
-          <w:i/>
-          <w:noProof/>
-          <w:u w:val="single"/>
-        </w:rPr>
-      </w:r>
-      <w:r>
-        <w:rPr>
-          <w:i/>
-          <w:noProof/>
-          <w:u w:val="single"/>
-        </w:rPr>
-      </w:r>
     </w:p>
     <w:p>
       <w:pPr>
@@ -9160,36 +8502,6 @@
         </w:rPr>
       </w:pPr>
       <w:r>
-        <w:rPr>
-          <w:b/>
-          <w:noProof/>
-        </w:rPr>
-      </w:r>
-      <w:r>
-        <w:rPr>
-          <w:b/>
-          <w:noProof/>
-        </w:rPr>
-      </w:r>
-      <w:r>
-        <w:rPr>
-          <w:b/>
-          <w:noProof/>
-        </w:rPr>
-      </w:r>
-      <w:r>
-        <w:rPr>
-          <w:b/>
-          <w:noProof/>
-        </w:rPr>
-      </w:r>
-      <w:r>
-        <w:rPr>
-          <w:b/>
-          <w:noProof/>
-        </w:rPr>
-      </w:r>
-      <w:r>
         <w:t>N/A</w:t>
       </w:r>
     </w:p>
@@ -9197,12 +8509,11 @@
       <w:pPr>
         <w:pStyle w:val="Heading3"/>
       </w:pPr>
-      <w:bookmarkStart w:id="60" w:name="_Toc170980862"/>
-      <w:r>
-        <w:lastRenderedPageBreak/>
+      <w:bookmarkStart w:id="59" w:name="_Toc170980862"/>
+      <w:r>
         <w:t>CÁC CÂU LỆNH SỬ DỤNG NHIỀU CPU</w:t>
       </w:r>
-      <w:bookmarkEnd w:id="60"/>
+      <w:bookmarkEnd w:id="59"/>
     </w:p>
     <w:p>
       <w:r>
@@ -9220,7 +8531,7 @@
           <w:lang w:eastAsia="x-none"/>
         </w:rPr>
       </w:pPr>
-      <w:bookmarkStart w:id="61" w:name="_Hlk144385613"/>
+      <w:bookmarkStart w:id="60" w:name="_Hlk144385613"/>
     </w:p>
     <w:p>
       <w:pPr>
@@ -9246,40 +8557,35 @@
       <w:pPr>
         <w:pStyle w:val="Heading2"/>
       </w:pPr>
-      <w:bookmarkStart w:id="62" w:name="_Toc170980863"/>
-      <w:bookmarkEnd w:id="61"/>
+      <w:bookmarkStart w:id="61" w:name="_Toc170980863"/>
+      <w:bookmarkEnd w:id="60"/>
       <w:r>
         <w:lastRenderedPageBreak/>
         <w:t>HIỆU SUẤT BỘ NHỚ</w:t>
       </w:r>
+      <w:bookmarkEnd w:id="61"/>
+    </w:p>
+    <w:p>
+      <w:pPr>
+        <w:pStyle w:val="Heading3"/>
+      </w:pPr>
+      <w:r>
+        <w:t xml:space="preserve">CẤU HÌNH </w:t>
+      </w:r>
+      <w:r>
+        <w:t>VÙNG NHỚ CHO CSDL</w:t>
+      </w:r>
+    </w:p>
+    <w:p>
+      <w:pPr>
+        <w:pStyle w:val="Heading3"/>
+      </w:pPr>
+      <w:bookmarkStart w:id="62" w:name="_Toc170980864"/>
       <w:bookmarkEnd w:id="62"/>
-    </w:p>
-    <w:p>
-      <w:pPr>
-        <w:pStyle w:val="Heading3"/>
-      </w:pPr>
-      <w:bookmarkStart w:id="63" w:name="_Toc170980864"/>
-      <w:r>
-        <w:t xml:space="preserve">CẤU HÌNH </w:t>
-      </w:r>
-      <w:r>
-        <w:t>VÙNG NHỚ CHO CSDL</w:t>
-      </w:r>
-      <w:bookmarkEnd w:id="63"/>
-    </w:p>
-    <w:p>
-      <w:pPr>
-        <w:pStyle w:val="Heading3"/>
-      </w:pPr>
-      <w:bookmarkStart w:id="63" w:name="_Toc170980864"/>
-      <w:r/>
-      <w:r/>
-      <w:bookmarkEnd w:id="63"/>
       <w:r>
         <w:t>&lt;memory_configuration&gt;</w:t>
       </w:r>
     </w:p>
-    <w:bookmarkEnd w:id="64"/>
     <w:p>
       <w:pPr>
         <w:ind w:left="720"/>
@@ -9319,11 +8625,6 @@
           <w:iCs/>
         </w:rPr>
         <w:t>{{assessment_memory_configuration}}</w:t>
-      </w:r>
-      <w:r>
-        <w:rPr>
-          <w:iCs/>
-        </w:rPr>
       </w:r>
     </w:p>
     <w:p>
@@ -9346,27 +8647,6 @@
         </w:rPr>
         <w:t>Khuyến nghị:</w:t>
       </w:r>
-      <w:r>
-        <w:rPr>
-          <w:rFonts w:cs="Arial"/>
-          <w:iCs/>
-          <w:color w:val="000000"/>
-        </w:rPr>
-      </w:r>
-      <w:r>
-        <w:rPr>
-          <w:rFonts w:cs="Arial"/>
-          <w:iCs/>
-          <w:color w:val="000000"/>
-        </w:rPr>
-      </w:r>
-      <w:r>
-        <w:rPr>
-          <w:rFonts w:cs="Arial"/>
-          <w:iCs/>
-          <w:color w:val="000000"/>
-        </w:rPr>
-      </w:r>
     </w:p>
     <w:p>
       <w:pPr>
@@ -9388,41 +8668,6 @@
         </w:rPr>
         <w:t>{{recommendation_memory_configuration}}</w:t>
       </w:r>
-      <w:r>
-        <w:rPr>
-          <w:rFonts w:cs="Arial"/>
-          <w:iCs/>
-          <w:color w:val="000000"/>
-        </w:rPr>
-      </w:r>
-      <w:r>
-        <w:rPr>
-          <w:rFonts w:cs="Arial"/>
-          <w:iCs/>
-          <w:color w:val="000000"/>
-        </w:rPr>
-      </w:r>
-      <w:r>
-        <w:rPr>
-          <w:rFonts w:cs="Arial"/>
-          <w:iCs/>
-          <w:color w:val="000000"/>
-        </w:rPr>
-      </w:r>
-      <w:r>
-        <w:rPr>
-          <w:rFonts w:cs="Arial"/>
-          <w:iCs/>
-          <w:color w:val="000000"/>
-        </w:rPr>
-      </w:r>
-      <w:r>
-        <w:rPr>
-          <w:rFonts w:cs="Arial"/>
-          <w:iCs/>
-          <w:color w:val="000000"/>
-        </w:rPr>
-      </w:r>
     </w:p>
     <w:p>
       <w:pPr>
@@ -9433,12 +8678,11 @@
       <w:pPr>
         <w:pStyle w:val="Heading3"/>
       </w:pPr>
-      <w:bookmarkStart w:id="65" w:name="_Toc170980865"/>
-      <w:r>
-        <w:lastRenderedPageBreak/>
+      <w:bookmarkStart w:id="63" w:name="_Toc170980865"/>
+      <w:r>
         <w:t>MEMORY STATISTICS</w:t>
       </w:r>
-      <w:bookmarkEnd w:id="65"/>
+      <w:bookmarkEnd w:id="63"/>
     </w:p>
     <w:p>
       <w:r>
@@ -9451,15 +8695,9 @@
           <w:caps/>
         </w:rPr>
       </w:pPr>
-      <w:bookmarkStart w:id="66" w:name="_Hlk144386014"/>
-      <w:r>
-        <w:rPr>
-          <w:caps/>
-          <w:noProof/>
-        </w:rPr>
-      </w:r>
-    </w:p>
-    <w:bookmarkEnd w:id="66"/>
+      <w:bookmarkStart w:id="64" w:name="_Hlk144386014"/>
+    </w:p>
+    <w:bookmarkEnd w:id="64"/>
     <w:p>
       <w:pPr>
         <w:pStyle w:val="ListParagraph"/>
@@ -9469,24 +8707,6 @@
           <w:noProof/>
         </w:rPr>
       </w:pPr>
-      <w:r>
-        <w:rPr>
-          <w:i/>
-          <w:u w:val="single"/>
-        </w:rPr>
-      </w:r>
-      <w:r>
-        <w:rPr>
-          <w:i/>
-          <w:u w:val="single"/>
-        </w:rPr>
-      </w:r>
-      <w:r>
-        <w:rPr>
-          <w:i/>
-          <w:u w:val="single"/>
-        </w:rPr>
-      </w:r>
     </w:p>
     <w:p>
       <w:pPr>
@@ -9496,15 +8716,9 @@
           <w:caps/>
         </w:rPr>
       </w:pPr>
-      <w:bookmarkStart w:id="67" w:name="_Hlk144386024"/>
-      <w:r>
-        <w:rPr>
-          <w:caps/>
-          <w:noProof/>
-        </w:rPr>
-      </w:r>
-    </w:p>
-    <w:bookmarkEnd w:id="67"/>
+      <w:bookmarkStart w:id="65" w:name="_Hlk144386024"/>
+    </w:p>
+    <w:bookmarkEnd w:id="65"/>
     <w:p>
       <w:pPr>
         <w:jc w:val="center"/>
@@ -9512,24 +8726,6 @@
           <w:i/>
         </w:rPr>
       </w:pPr>
-      <w:r>
-        <w:rPr>
-          <w:i/>
-          <w:u w:val="single"/>
-        </w:rPr>
-      </w:r>
-      <w:r>
-        <w:rPr>
-          <w:i/>
-          <w:u w:val="single"/>
-        </w:rPr>
-      </w:r>
-      <w:r>
-        <w:rPr>
-          <w:i/>
-          <w:u w:val="single"/>
-        </w:rPr>
-      </w:r>
     </w:p>
     <w:p>
       <w:pPr>
@@ -9550,7 +8746,7 @@
       <w:pPr>
         <w:pStyle w:val="Heading3"/>
       </w:pPr>
-      <w:bookmarkStart w:id="68" w:name="_Toc170980866"/>
+      <w:bookmarkStart w:id="66" w:name="_Toc170980866"/>
       <w:r>
         <w:lastRenderedPageBreak/>
         <w:t xml:space="preserve">SYSTEM GLOBAL </w:t>
@@ -9561,7 +8757,7 @@
       <w:r>
         <w:t>REA</w:t>
       </w:r>
-      <w:bookmarkEnd w:id="68"/>
+      <w:bookmarkEnd w:id="66"/>
     </w:p>
     <w:p>
       <w:pPr>
@@ -9580,7 +8776,7 @@
           <w:lang w:val="en-US"/>
         </w:rPr>
       </w:pPr>
-      <w:bookmarkStart w:id="69" w:name="_Toc170980867"/>
+      <w:bookmarkStart w:id="67" w:name="_Toc170980867"/>
       <w:r>
         <w:rPr>
           <w:color w:val="auto"/>
@@ -9588,7 +8784,7 @@
         </w:rPr>
         <w:t>SGA STATISTICS</w:t>
       </w:r>
-      <w:bookmarkEnd w:id="69"/>
+      <w:bookmarkEnd w:id="67"/>
     </w:p>
     <w:p>
       <w:r>
@@ -9601,15 +8797,9 @@
           <w:iCs/>
         </w:rPr>
       </w:pPr>
-      <w:bookmarkStart w:id="70" w:name="_Hlk144386037"/>
-      <w:r>
-        <w:rPr>
-          <w:iCs/>
-          <w:noProof/>
-        </w:rPr>
-      </w:r>
-    </w:p>
-    <w:bookmarkEnd w:id="70"/>
+      <w:bookmarkStart w:id="68" w:name="_Hlk144386037"/>
+    </w:p>
+    <w:bookmarkEnd w:id="68"/>
     <w:p>
       <w:pPr>
         <w:pStyle w:val="ListParagraph"/>
@@ -9619,36 +8809,6 @@
           <w:noProof/>
         </w:rPr>
       </w:pPr>
-      <w:r>
-        <w:rPr>
-          <w:i/>
-          <w:u w:val="single"/>
-        </w:rPr>
-      </w:r>
-      <w:r>
-        <w:rPr>
-          <w:i/>
-          <w:u w:val="single"/>
-        </w:rPr>
-      </w:r>
-      <w:r>
-        <w:rPr>
-          <w:i/>
-          <w:u w:val="single"/>
-        </w:rPr>
-      </w:r>
-      <w:r>
-        <w:rPr>
-          <w:i/>
-          <w:u w:val="single"/>
-        </w:rPr>
-      </w:r>
-      <w:r>
-        <w:rPr>
-          <w:i/>
-          <w:u w:val="single"/>
-        </w:rPr>
-      </w:r>
     </w:p>
     <w:p>
       <w:pPr>
@@ -9658,12 +8818,6 @@
           <w:i/>
         </w:rPr>
       </w:pPr>
-      <w:r>
-        <w:rPr>
-          <w:i/>
-          <w:noProof/>
-        </w:rPr>
-      </w:r>
     </w:p>
     <w:p>
       <w:pPr>
@@ -9674,48 +8828,6 @@
           <w:caps/>
         </w:rPr>
       </w:pPr>
-      <w:r>
-        <w:rPr>
-          <w:i/>
-          <w:u w:val="single"/>
-        </w:rPr>
-      </w:r>
-      <w:r>
-        <w:rPr>
-          <w:i/>
-          <w:u w:val="single"/>
-        </w:rPr>
-      </w:r>
-      <w:r>
-        <w:rPr>
-          <w:i/>
-          <w:u w:val="single"/>
-        </w:rPr>
-      </w:r>
-      <w:r>
-        <w:rPr>
-          <w:i/>
-          <w:u w:val="single"/>
-        </w:rPr>
-      </w:r>
-      <w:r>
-        <w:rPr>
-          <w:i/>
-          <w:u w:val="single"/>
-        </w:rPr>
-      </w:r>
-      <w:r>
-        <w:rPr>
-          <w:i/>
-          <w:caps/>
-        </w:rPr>
-      </w:r>
-      <w:r>
-        <w:rPr>
-          <w:i/>
-          <w:caps/>
-        </w:rPr>
-      </w:r>
     </w:p>
     <w:p>
       <w:pPr>
@@ -9734,16 +8846,15 @@
           <w:lang w:val="en-US"/>
         </w:rPr>
       </w:pPr>
-      <w:bookmarkStart w:id="71" w:name="_Toc170980868"/>
+      <w:bookmarkStart w:id="69" w:name="_Toc170980868"/>
       <w:r>
         <w:rPr>
           <w:color w:val="auto"/>
           <w:lang w:val="en-US"/>
         </w:rPr>
-        <w:lastRenderedPageBreak/>
         <w:t>BUFFER CACHE HIT</w:t>
       </w:r>
-      <w:bookmarkEnd w:id="71"/>
+      <w:bookmarkEnd w:id="69"/>
     </w:p>
     <w:p>
       <w:r>
@@ -9751,7 +8862,7 @@
       </w:r>
     </w:p>
     <w:p>
-      <w:bookmarkStart w:id="72" w:name="_Hlk144386074"/>
+      <w:bookmarkStart w:id="70" w:name="_Hlk144386074"/>
     </w:p>
     <w:p>
       <w:pPr>
@@ -9770,8 +8881,8 @@
           <w:lang w:val="en-US"/>
         </w:rPr>
       </w:pPr>
-      <w:bookmarkStart w:id="73" w:name="_Toc170980869"/>
-      <w:bookmarkEnd w:id="72"/>
+      <w:bookmarkStart w:id="71" w:name="_Toc170980869"/>
+      <w:bookmarkEnd w:id="70"/>
       <w:r>
         <w:rPr>
           <w:color w:val="auto"/>
@@ -9779,7 +8890,7 @@
         </w:rPr>
         <w:t>LIBRARY CACHE HIT</w:t>
       </w:r>
-      <w:bookmarkEnd w:id="73"/>
+      <w:bookmarkEnd w:id="71"/>
     </w:p>
     <w:p>
       <w:r>
@@ -9837,36 +8948,6 @@
           <w:color w:val="000000"/>
         </w:rPr>
       </w:pPr>
-      <w:r>
-        <w:rPr>
-          <w:color w:val="000000"/>
-        </w:rPr>
-      </w:r>
-      <w:r>
-        <w:rPr>
-          <w:color w:val="000000"/>
-        </w:rPr>
-      </w:r>
-      <w:r>
-        <w:rPr>
-          <w:color w:val="000000"/>
-        </w:rPr>
-      </w:r>
-      <w:r>
-        <w:rPr>
-          <w:color w:val="000000"/>
-        </w:rPr>
-      </w:r>
-      <w:r>
-        <w:rPr>
-          <w:color w:val="000000"/>
-        </w:rPr>
-      </w:r>
-      <w:r>
-        <w:rPr>
-          <w:color w:val="000000"/>
-        </w:rPr>
-      </w:r>
     </w:p>
     <w:p>
       <w:pPr>
@@ -9939,12 +9020,12 @@
       <w:pPr>
         <w:pStyle w:val="Heading3"/>
       </w:pPr>
-      <w:bookmarkStart w:id="74" w:name="_Toc170980870"/>
+      <w:bookmarkStart w:id="72" w:name="_Toc170980870"/>
       <w:r>
         <w:lastRenderedPageBreak/>
         <w:t>PGA</w:t>
       </w:r>
-      <w:bookmarkEnd w:id="74"/>
+      <w:bookmarkEnd w:id="72"/>
     </w:p>
     <w:p>
       <w:r>
@@ -9957,15 +9038,9 @@
           <w:iCs/>
         </w:rPr>
       </w:pPr>
-      <w:bookmarkStart w:id="75" w:name="_Hlk144386113"/>
-      <w:r>
-        <w:rPr>
-          <w:iCs/>
-          <w:noProof/>
-        </w:rPr>
-      </w:r>
-    </w:p>
-    <w:bookmarkEnd w:id="75"/>
+      <w:bookmarkStart w:id="73" w:name="_Hlk144386113"/>
+    </w:p>
+    <w:bookmarkEnd w:id="73"/>
     <w:p>
       <w:pPr>
         <w:pStyle w:val="ListParagraph"/>
@@ -9975,36 +9050,6 @@
           <w:noProof/>
         </w:rPr>
       </w:pPr>
-      <w:r>
-        <w:rPr>
-          <w:i/>
-          <w:u w:val="single"/>
-        </w:rPr>
-      </w:r>
-      <w:r>
-        <w:rPr>
-          <w:i/>
-          <w:u w:val="single"/>
-        </w:rPr>
-      </w:r>
-      <w:r>
-        <w:rPr>
-          <w:i/>
-          <w:u w:val="single"/>
-        </w:rPr>
-      </w:r>
-      <w:r>
-        <w:rPr>
-          <w:i/>
-          <w:u w:val="single"/>
-        </w:rPr>
-      </w:r>
-      <w:r>
-        <w:rPr>
-          <w:i/>
-          <w:u w:val="single"/>
-        </w:rPr>
-      </w:r>
     </w:p>
     <w:p>
       <w:pPr>
@@ -10014,12 +9059,6 @@
           <w:i/>
         </w:rPr>
       </w:pPr>
-      <w:r>
-        <w:rPr>
-          <w:i/>
-          <w:noProof/>
-        </w:rPr>
-      </w:r>
     </w:p>
     <w:p>
       <w:pPr>
@@ -10028,36 +9067,6 @@
           <w:b/>
         </w:rPr>
       </w:pPr>
-      <w:r>
-        <w:rPr>
-          <w:i/>
-          <w:u w:val="single"/>
-        </w:rPr>
-      </w:r>
-      <w:r>
-        <w:rPr>
-          <w:i/>
-          <w:u w:val="single"/>
-        </w:rPr>
-      </w:r>
-      <w:r>
-        <w:rPr>
-          <w:i/>
-          <w:u w:val="single"/>
-        </w:rPr>
-      </w:r>
-      <w:r>
-        <w:rPr>
-          <w:i/>
-          <w:u w:val="single"/>
-        </w:rPr>
-      </w:r>
-      <w:r>
-        <w:rPr>
-          <w:i/>
-          <w:u w:val="single"/>
-        </w:rPr>
-      </w:r>
     </w:p>
     <w:p>
       <w:pPr>
@@ -10099,16 +9108,6 @@
           <w:i/>
         </w:rPr>
       </w:pPr>
-      <w:r>
-        <w:rPr>
-          <w:iCs/>
-        </w:rPr>
-      </w:r>
-      <w:r>
-        <w:rPr>
-          <w:i/>
-        </w:rPr>
-      </w:r>
     </w:p>
     <w:p>
       <w:pPr>
@@ -10177,141 +9176,114 @@
       <w:pPr>
         <w:pStyle w:val="Heading1"/>
       </w:pPr>
-      <w:bookmarkStart w:id="76" w:name="_Toc170980871"/>
+      <w:bookmarkStart w:id="74" w:name="_Toc170980871"/>
       <w:r>
         <w:lastRenderedPageBreak/>
         <w:t>BẢO MẬT</w:t>
       </w:r>
+      <w:bookmarkEnd w:id="74"/>
+      <w:r>
+        <w:t xml:space="preserve"> </w:t>
+      </w:r>
+    </w:p>
+    <w:p>
+      <w:pPr>
+        <w:pStyle w:val="Heading2"/>
+      </w:pPr>
+      <w:r>
+        <w:t xml:space="preserve">PROFILE </w:t>
+      </w:r>
+    </w:p>
+    <w:p>
+      <w:pPr>
+        <w:pStyle w:val="Heading2"/>
+      </w:pPr>
+      <w:bookmarkStart w:id="75" w:name="_Toc170980872"/>
+      <w:bookmarkEnd w:id="75"/>
+      <w:r>
+        <w:t>&lt;profiles&gt;</w:t>
+      </w:r>
+    </w:p>
+    <w:p>
+      <w:pPr>
+        <w:pStyle w:val="Heading2"/>
+      </w:pPr>
+      <w:r>
+        <w:t>USERS WITH DEFAULT PASSWORD</w:t>
+      </w:r>
+    </w:p>
+    <w:p>
+      <w:pPr>
+        <w:pStyle w:val="Heading2"/>
+      </w:pPr>
+      <w:bookmarkStart w:id="76" w:name="_Toc170980873"/>
       <w:bookmarkEnd w:id="76"/>
       <w:r>
-        <w:t xml:space="preserve"> </w:t>
+        <w:t>&lt;users_with_default_password&gt;</w:t>
       </w:r>
     </w:p>
     <w:p>
       <w:pPr>
         <w:pStyle w:val="Heading2"/>
       </w:pPr>
-      <w:bookmarkStart w:id="77" w:name="_Toc170980872"/>
-      <w:r>
-        <w:t>PROFILE</w:t>
-      </w:r>
+      <w:r>
+        <w:t>PACKAGE TO PUBLIC</w:t>
+      </w:r>
+    </w:p>
+    <w:p>
+      <w:pPr>
+        <w:pStyle w:val="Heading2"/>
+      </w:pPr>
+      <w:bookmarkStart w:id="77" w:name="_Toc170980874"/>
       <w:bookmarkEnd w:id="77"/>
       <w:r>
-        <w:t xml:space="preserve"> </w:t>
+        <w:t>&lt;package_to_public&gt;</w:t>
       </w:r>
     </w:p>
     <w:p>
       <w:pPr>
         <w:pStyle w:val="Heading2"/>
       </w:pPr>
-      <w:bookmarkStart w:id="77" w:name="_Toc170980872"/>
-      <w:r/>
-      <w:bookmarkEnd w:id="77"/>
-      <w:r/>
-      <w:r>
-        <w:t>&lt;profiles&gt;</w:t>
+      <w:r>
+        <w:rPr>
+          <w:caps w:val="0"/>
+        </w:rPr>
+        <w:t>USERS WITH SENSITIVE ROLES GRANTED</w:t>
       </w:r>
     </w:p>
     <w:p>
       <w:pPr>
         <w:pStyle w:val="Heading2"/>
       </w:pPr>
-      <w:bookmarkStart w:id="78" w:name="_Toc170980873"/>
-      <w:r>
-        <w:t>USERS WITH DEFAULT PASSWORD</w:t>
-      </w:r>
+      <w:bookmarkStart w:id="78" w:name="_Toc170980875"/>
       <w:bookmarkEnd w:id="78"/>
+      <w:r>
+        <w:t>&lt;users_with_sensitive_roles_granted&gt;</w:t>
+      </w:r>
     </w:p>
     <w:p>
       <w:pPr>
         <w:pStyle w:val="Heading2"/>
-      </w:pPr>
-      <w:bookmarkStart w:id="78" w:name="_Toc170980873"/>
-      <w:r/>
-      <w:bookmarkEnd w:id="78"/>
-      <w:r>
-        <w:t>&lt;users_with_default_password&gt;</w:t>
+        <w:rPr>
+          <w:caps w:val="0"/>
+        </w:rPr>
+      </w:pPr>
+      <w:r>
+        <w:rPr>
+          <w:caps w:val="0"/>
+        </w:rPr>
+        <w:t>USERS WITH OBJECTS IN TABLESPACE SYSTEM, SYSAUX</w:t>
       </w:r>
     </w:p>
     <w:p>
       <w:pPr>
         <w:pStyle w:val="Heading2"/>
-      </w:pPr>
-      <w:bookmarkStart w:id="79" w:name="_Toc170980874"/>
-      <w:r>
-        <w:t>PACKAGE TO PUBLIC</w:t>
-      </w:r>
+        <w:rPr>
+          <w:caps w:val="0"/>
+        </w:rPr>
+      </w:pPr>
+      <w:bookmarkStart w:id="79" w:name="_Toc170980876"/>
       <w:bookmarkEnd w:id="79"/>
-    </w:p>
-    <w:p>
-      <w:pPr>
-        <w:pStyle w:val="Heading2"/>
-      </w:pPr>
-      <w:bookmarkStart w:id="79" w:name="_Toc170980874"/>
-      <w:r/>
-      <w:bookmarkEnd w:id="79"/>
-      <w:r>
-        <w:t>&lt;package_to_public&gt;</w:t>
-      </w:r>
-    </w:p>
-    <w:p>
-      <w:pPr>
-        <w:pStyle w:val="Heading2"/>
-      </w:pPr>
-      <w:bookmarkStart w:id="80" w:name="_Toc170980875"/>
-      <w:r>
-        <w:rPr>
-          <w:caps w:val="0"/>
-        </w:rPr>
-        <w:t>USERS WITH SENSITIVE ROLES GRANTED</w:t>
-      </w:r>
-      <w:bookmarkEnd w:id="80"/>
-    </w:p>
-    <w:p>
-      <w:pPr>
-        <w:pStyle w:val="Heading2"/>
-      </w:pPr>
-      <w:bookmarkStart w:id="80" w:name="_Toc170980875"/>
-      <w:r>
-        <w:rPr>
-          <w:caps w:val="0"/>
-        </w:rPr>
-      </w:r>
-      <w:bookmarkEnd w:id="80"/>
-      <w:r>
-        <w:t>&lt;users_with_sensitive_roles_granted&gt;</w:t>
-      </w:r>
-    </w:p>
-    <w:p>
-      <w:pPr>
-        <w:pStyle w:val="Heading2"/>
-        <w:rPr>
-          <w:caps w:val="0"/>
-        </w:rPr>
-      </w:pPr>
-      <w:bookmarkStart w:id="81" w:name="_Toc170980876"/>
-      <w:r>
-        <w:rPr>
-          <w:caps w:val="0"/>
-        </w:rPr>
-        <w:t>USERS WITH OBJECTS IN TABLESPACE SYSTEM, SYSAUX</w:t>
-      </w:r>
-      <w:bookmarkEnd w:id="81"/>
-    </w:p>
-    <w:p>
-      <w:pPr>
-        <w:pStyle w:val="Heading2"/>
-        <w:rPr>
-          <w:caps w:val="0"/>
-        </w:rPr>
-      </w:pPr>
-      <w:bookmarkStart w:id="81" w:name="_Toc170980876"/>
-      <w:r>
-        <w:rPr>
-          <w:caps w:val="0"/>
-        </w:rPr>
-      </w:r>
-      <w:bookmarkEnd w:id="81"/>
       <w:r>
         <w:t>&lt;users_with_objects_in_tablespace_system_sysaux&gt;</w:t>
       </w:r>
@@ -10335,16 +9307,16 @@
           <w:numId w:val="4"/>
         </w:numPr>
       </w:pPr>
-      <w:bookmarkStart w:id="82" w:name="_Toc104793547"/>
-      <w:bookmarkStart w:id="83" w:name="_Toc109304952"/>
-      <w:bookmarkStart w:id="84" w:name="_Toc170980877"/>
+      <w:bookmarkStart w:id="80" w:name="_Toc104793547"/>
+      <w:bookmarkStart w:id="81" w:name="_Toc109304952"/>
+      <w:bookmarkStart w:id="82" w:name="_Toc170980877"/>
       <w:r>
         <w:lastRenderedPageBreak/>
         <w:t>PATCHING AND BACKUP</w:t>
       </w:r>
+      <w:bookmarkEnd w:id="80"/>
+      <w:bookmarkEnd w:id="81"/>
       <w:bookmarkEnd w:id="82"/>
-      <w:bookmarkEnd w:id="83"/>
-      <w:bookmarkEnd w:id="84"/>
     </w:p>
     <w:p>
       <w:pPr>
@@ -10365,7 +9337,6 @@
       <w:r>
         <w:t>{{assessment_patching}}</w:t>
       </w:r>
-      <w:r/>
     </w:p>
     <w:p>
       <w:pPr>
@@ -10374,8 +9345,6 @@
       <w:r>
         <w:t>{{recommendation_patching}}</w:t>
       </w:r>
-      <w:r/>
-      <w:r/>
     </w:p>
     <w:p>
       <w:pPr>
@@ -10396,7 +9365,6 @@
       <w:r>
         <w:t>{{assessment_backup}}</w:t>
       </w:r>
-      <w:r/>
     </w:p>
     <w:p>
       <w:pPr>
@@ -10477,53 +9445,6 @@
     </w:pPr>
     <w:r>
       <w:t>{{database_display_name}} - {{collection_date}}</w:t>
-    </w:r>
-    <w:r/>
-    <w:r>
-      <w:rPr>
-        <w:rFonts w:cs="Arial"/>
-        <w:bCs/>
-      </w:rPr>
-    </w:r>
-    <w:r>
-      <w:rPr>
-        <w:rFonts w:cs="Arial"/>
-        <w:bCs/>
-      </w:rPr>
-    </w:r>
-    <w:r>
-      <w:rPr>
-        <w:rFonts w:cs="Arial"/>
-        <w:bCs/>
-      </w:rPr>
-    </w:r>
-    <w:r/>
-    <w:r/>
-    <w:r>
-      <w:rPr>
-        <w:rStyle w:val="PageNumber"/>
-      </w:rPr>
-    </w:r>
-    <w:r>
-      <w:rPr>
-        <w:rStyle w:val="PageNumber"/>
-      </w:rPr>
-    </w:r>
-    <w:r>
-      <w:rPr>
-        <w:rStyle w:val="PageNumber"/>
-      </w:rPr>
-    </w:r>
-    <w:r>
-      <w:rPr>
-        <w:rStyle w:val="PageNumber"/>
-        <w:noProof/>
-      </w:rPr>
-    </w:r>
-    <w:r>
-      <w:rPr>
-        <w:rStyle w:val="PageNumber"/>
-      </w:rPr>
     </w:r>
   </w:p>
 </w:ftr>
@@ -10545,38 +9466,6 @@
     </w:pPr>
     <w:r>
       <w:t>{{database_display_name}} - {{collection_date}}</w:t>
-    </w:r>
-    <w:r/>
-    <w:r/>
-    <w:r/>
-    <w:r/>
-    <w:r/>
-    <w:r/>
-    <w:r>
-      <w:rPr>
-        <w:rStyle w:val="PageNumber"/>
-      </w:rPr>
-    </w:r>
-    <w:r>
-      <w:rPr>
-        <w:rStyle w:val="PageNumber"/>
-      </w:rPr>
-    </w:r>
-    <w:r>
-      <w:rPr>
-        <w:rStyle w:val="PageNumber"/>
-      </w:rPr>
-    </w:r>
-    <w:r>
-      <w:rPr>
-        <w:rStyle w:val="PageNumber"/>
-        <w:noProof/>
-      </w:rPr>
-    </w:r>
-    <w:r>
-      <w:rPr>
-        <w:rStyle w:val="PageNumber"/>
-      </w:rPr>
     </w:r>
   </w:p>
 </w:ftr>
@@ -13570,6 +12459,7 @@
   <w:style w:type="character" w:default="1" w:styleId="DefaultParagraphFont">
     <w:name w:val="Default Paragraph Font"/>
     <w:uiPriority w:val="1"/>
+    <w:semiHidden/>
     <w:unhideWhenUsed/>
   </w:style>
   <w:style w:type="table" w:default="1" w:styleId="TableNormal">

</xml_diff>

<commit_message>
Update EDB360 assessment wording
</commit_message>
<xml_diff>
--- a/templates/edb360_master.docx
+++ b/templates/edb360_master.docx
@@ -4533,30 +4533,9 @@
             <w:tcW w:w="2127" w:type="pct"/>
           </w:tcPr>
           <w:p>
-            <w:pPr>
-              <w:rPr>
-                <w:rFonts w:ascii="Times New Roman" w:hAnsi="Times New Roman" w:eastAsia="Times New Roman" w:cs="Times New Roman"/>
-                <w:sz w:val="20"/>
-                <w:szCs w:val="20"/>
-              </w:rPr>
-            </w:pPr>
             <w:r>
-              <w:rPr>
-                <w:rStyle w:val="142"/>
-                <w:rFonts w:cs="Times New Roman" w:eastAsiaTheme="majorEastAsia"/>
-                <w:color w:val="auto"/>
-              </w:rPr>
               <w:t>{{assessment_redo_log}}</w:t>
             </w:r>
-          </w:p>
-          <w:p>
-            <w:pPr>
-              <w:rPr>
-                <w:rFonts w:ascii="Cambria" w:hAnsi="Cambria" w:eastAsia="Times New Roman" w:cs="Times New Roman"/>
-                <w:sz w:val="24"/>
-                <w:szCs w:val="24"/>
-              </w:rPr>
-            </w:pPr>
           </w:p>
         </w:tc>
         <w:tc>
@@ -4564,19 +4543,7 @@
             <w:tcW w:w="1436" w:type="pct"/>
           </w:tcPr>
           <w:p>
-            <w:pPr>
-              <w:rPr>
-                <w:rFonts w:ascii="Cambria" w:hAnsi="Cambria" w:eastAsia="Times New Roman" w:cs="Times New Roman"/>
-                <w:sz w:val="24"/>
-                <w:szCs w:val="24"/>
-              </w:rPr>
-            </w:pPr>
             <w:r>
-              <w:rPr>
-                <w:rFonts w:ascii="Times New Roman" w:hAnsi="Times New Roman" w:eastAsia="Times New Roman" w:cs="Times New Roman"/>
-                <w:sz w:val="20"/>
-                <w:szCs w:val="20"/>
-              </w:rPr>
               <w:t>{{recommendation_redo_log}}</w:t>
             </w:r>
           </w:p>
@@ -5174,20 +5141,8 @@
             <w:tcW w:w="2127" w:type="pct"/>
           </w:tcPr>
           <w:p>
-            <w:pPr>
-              <w:rPr>
-                <w:rFonts w:ascii="Cambria" w:hAnsi="Cambria" w:eastAsia="Times New Roman" w:cs="Times New Roman"/>
-                <w:sz w:val="24"/>
-                <w:szCs w:val="24"/>
-              </w:rPr>
-            </w:pPr>
             <w:r>
-              <w:rPr>
-                <w:rFonts w:ascii="Cambria" w:hAnsi="Cambria" w:eastAsia="Times New Roman" w:cs="Times New Roman"/>
-                <w:sz w:val="24"/>
-                <w:szCs w:val="24"/>
-              </w:rPr>
-              <w:t xml:space="preserve">Nhìn chung, các instance cơ sở dữ liệu sử dụng trung bình 10 – 12% CPU server. </w:t>
+              <w:t>{{assessment_oracle_foreground_process}}</w:t>
             </w:r>
           </w:p>
         </w:tc>
@@ -5196,13 +5151,9 @@
             <w:tcW w:w="1436" w:type="pct"/>
           </w:tcPr>
           <w:p>
-            <w:pPr>
-              <w:rPr>
-                <w:rFonts w:ascii="Cambria" w:hAnsi="Cambria" w:eastAsia="Times New Roman" w:cs="Times New Roman"/>
-                <w:sz w:val="24"/>
-                <w:szCs w:val="24"/>
-              </w:rPr>
-            </w:pPr>
+            <w:r>
+              <w:t>{{recommendation_oracle_foreground_process}}</w:t>
+            </w:r>
           </w:p>
         </w:tc>
       </w:tr>
@@ -5373,32 +5324,9 @@
             <w:tcW w:w="2127" w:type="pct"/>
           </w:tcPr>
           <w:p>
-            <w:pPr>
-              <w:rPr>
-                <w:rFonts w:ascii="Cambria" w:hAnsi="Cambria" w:eastAsia="Times New Roman" w:cs="Times New Roman"/>
-                <w:color w:val="000000"/>
-                <w:sz w:val="24"/>
-                <w:szCs w:val="24"/>
-              </w:rPr>
-            </w:pPr>
             <w:r>
-              <w:rPr>
-                <w:rFonts w:ascii="Cambria" w:hAnsi="Cambria" w:eastAsia="Times New Roman" w:cs="Times New Roman"/>
-                <w:color w:val="000000"/>
-                <w:sz w:val="24"/>
-                <w:szCs w:val="24"/>
-              </w:rPr>
-              <w:t xml:space="preserve">Tỉ lệ buffer cache hit và library cache hit đang ở ngưỡng tối ưu 99 – 100%. </w:t>
+              <w:t>{{assessment_buffer_cache_hit}}</w:t>
             </w:r>
-          </w:p>
-          <w:p>
-            <w:pPr>
-              <w:rPr>
-                <w:rFonts w:ascii="Cambria" w:hAnsi="Cambria" w:eastAsia="Times New Roman" w:cs="Times New Roman"/>
-                <w:sz w:val="24"/>
-                <w:szCs w:val="24"/>
-              </w:rPr>
-            </w:pPr>
           </w:p>
         </w:tc>
         <w:tc>
@@ -5406,13 +5334,9 @@
             <w:tcW w:w="1436" w:type="pct"/>
           </w:tcPr>
           <w:p>
-            <w:pPr>
-              <w:rPr>
-                <w:rFonts w:ascii="Cambria" w:hAnsi="Cambria" w:eastAsia="Times New Roman" w:cs="Times New Roman"/>
-                <w:sz w:val="24"/>
-                <w:szCs w:val="24"/>
-              </w:rPr>
-            </w:pPr>
+            <w:r>
+              <w:t>{{recommendation_buffer_cache_hit}}</w:t>
+            </w:r>
           </w:p>
         </w:tc>
       </w:tr>
@@ -5464,20 +5388,8 @@
             <w:tcW w:w="2127" w:type="pct"/>
           </w:tcPr>
           <w:p>
-            <w:pPr>
-              <w:rPr>
-                <w:rFonts w:ascii="Cambria" w:hAnsi="Cambria" w:eastAsia="Times New Roman" w:cs="Times New Roman"/>
-                <w:sz w:val="24"/>
-                <w:szCs w:val="24"/>
-              </w:rPr>
-            </w:pPr>
             <w:r>
-              <w:rPr>
-                <w:rFonts w:ascii="Cambria" w:hAnsi="Cambria" w:eastAsia="Times New Roman" w:cs="Times New Roman"/>
-                <w:sz w:val="24"/>
-                <w:szCs w:val="24"/>
-              </w:rPr>
-              <w:t xml:space="preserve">Tỉ lệ buffer cache hit và library cache hit đang ở ngưỡng tối ưu 99 – 100%. </w:t>
+              <w:t>{{assessment_library_cache_hit}}</w:t>
             </w:r>
           </w:p>
         </w:tc>
@@ -5486,13 +5398,9 @@
             <w:tcW w:w="1436" w:type="pct"/>
           </w:tcPr>
           <w:p>
-            <w:pPr>
-              <w:rPr>
-                <w:rFonts w:ascii="Cambria" w:hAnsi="Cambria" w:eastAsia="Times New Roman" w:cs="Times New Roman"/>
-                <w:sz w:val="24"/>
-                <w:szCs w:val="24"/>
-              </w:rPr>
-            </w:pPr>
+            <w:r>
+              <w:t>{{recommendation_library_cache_hit}}</w:t>
+            </w:r>
           </w:p>
         </w:tc>
       </w:tr>
@@ -5544,42 +5452,9 @@
             <w:tcW w:w="2127" w:type="pct"/>
           </w:tcPr>
           <w:p>
-            <w:pPr>
-              <w:jc w:val="both"/>
-              <w:rPr>
-                <w:rFonts w:ascii="Times New Roman" w:hAnsi="Times New Roman" w:eastAsia="Times New Roman" w:cs="Times New Roman"/>
-                <w:i/>
-                <w:sz w:val="24"/>
-                <w:szCs w:val="24"/>
-              </w:rPr>
-            </w:pPr>
             <w:r>
-              <w:rPr>
-                <w:rFonts w:ascii="Times New Roman" w:hAnsi="Times New Roman" w:eastAsia="Times New Roman" w:cs="Times New Roman"/>
-                <w:iCs/>
-                <w:sz w:val="24"/>
-                <w:szCs w:val="24"/>
-              </w:rPr>
-              <w:t>Nhìn chung, vùng nhớ PGA được CSDL sử dụng vẫn nằm trong mức an toàn</w:t>
+              <w:t>{{assessment_pga}}</w:t>
             </w:r>
-            <w:r>
-              <w:rPr>
-                <w:rFonts w:ascii="Times New Roman" w:hAnsi="Times New Roman" w:eastAsia="Times New Roman" w:cs="Times New Roman"/>
-                <w:i/>
-                <w:sz w:val="24"/>
-                <w:szCs w:val="24"/>
-              </w:rPr>
-              <w:t>.</w:t>
-            </w:r>
-          </w:p>
-          <w:p>
-            <w:pPr>
-              <w:rPr>
-                <w:rFonts w:ascii="Cambria" w:hAnsi="Cambria" w:eastAsia="Times New Roman" w:cs="Times New Roman"/>
-                <w:sz w:val="24"/>
-                <w:szCs w:val="24"/>
-              </w:rPr>
-            </w:pPr>
           </w:p>
         </w:tc>
         <w:tc>
@@ -5587,13 +5462,9 @@
             <w:tcW w:w="1436" w:type="pct"/>
           </w:tcPr>
           <w:p>
-            <w:pPr>
-              <w:rPr>
-                <w:rFonts w:ascii="Cambria" w:hAnsi="Cambria" w:eastAsia="Times New Roman" w:cs="Times New Roman"/>
-                <w:sz w:val="24"/>
-                <w:szCs w:val="24"/>
-              </w:rPr>
-            </w:pPr>
+            <w:r>
+              <w:t>{{recommendation_pga}}</w:t>
+            </w:r>
           </w:p>
         </w:tc>
       </w:tr>
@@ -6217,7 +6088,7 @@
         <w:rPr>
           <w:rFonts w:eastAsia="Cambria" w:cs="Cambria"/>
         </w:rPr>
-        <w:t>Trong thời điểm bình thường, tổng số lần switch của 2 instance khoảng 5-10 lần/giờ. Trong giờ cao điểm tổng số lần switch của 2 instance khoảng 35-60 lần/giờ. Tần suất này là khá cao, gây ảnh hưởng tới việc đọc ghi của các instance.</w:t>
+        <w:t>{{assessment_log_switch}}</w:t>
       </w:r>
     </w:p>
     <w:p>
@@ -6231,13 +6102,12 @@
         <w:rPr>
           <w:b/>
         </w:rPr>
-        <w:t xml:space="preserve">Khuyến nghị: </w:t>
+        <w:t>Khuyến nghị: {{recommendation_log_switch}}</w:t>
       </w:r>
       <w:r>
         <w:rPr>
           <w:rFonts w:eastAsia="Cambria" w:cs="Cambria"/>
         </w:rPr>
-        <w:t>Tăng thêm dung lượng cho redo log file,</w:t>
       </w:r>
     </w:p>
     <w:p>
@@ -7492,7 +7362,7 @@
         <w:ind w:left="1440"/>
       </w:pPr>
       <w:r>
-        <w:t>Nhìn chung, các instance cơ sở dữ liệu sử dụng trung bình 10 - 12% CPU server.</w:t>
+        <w:t>{{assessment_oracle_foreground_process}}</w:t>
       </w:r>
     </w:p>
     <w:p>
@@ -7919,7 +7789,7 @@
           <w:sz w:val="24"/>
           <w:szCs w:val="24"/>
         </w:rPr>
-        <w:t>Tỉ lệ buffer cache hit và library cache hit đang ở ngưỡng tối ưu 99 – 100%</w:t>
+        <w:t>{{assessment_cache_hit}}</w:t>
       </w:r>
       <w:bookmarkStart w:id="83" w:name="_GoBack"/>
       <w:bookmarkEnd w:id="83"/>
@@ -7953,7 +7823,7 @@
         </w:rPr>
       </w:pPr>
       <w:r>
-        <w:br w:type="page"/>
+        <w:t>{{recommendation_pga}}</w:t>
       </w:r>
     </w:p>
     <w:p>
@@ -8026,6 +7896,9 @@
           <w:i/>
         </w:rPr>
       </w:pPr>
+      <w:r>
+        <w:t>{{assessment_pga}}</w:t>
+      </w:r>
     </w:p>
     <w:p>
       <w:pPr>

</xml_diff>